<commit_message>
Yaping 1.0.1: release with persistent API keys
Bump version to 1.0.1 (build 2), point the download links to the
yaping-v1.0.1 release, add release notes for the API key fix and update
the version in the technical documentation.
</commit_message>
<xml_diff>
--- a/Yaping/docs/Dokumentasi Teknis Yaping.docx
+++ b/Yaping/docs/Dokumentasi Teknis Yaping.docx
@@ -16,7 +16,7 @@
           <w:noProof/>
         </w:rPr>
         <w:drawing>
-          <wp:inline distT="0" distB="0" distL="0" distR="0" wp14:anchorId="0CC680AD" wp14:editId="36432DE3">
+          <wp:inline distT="0" distB="0" distL="0" distR="0" wp14:anchorId="6936ADF7" wp14:editId="71BCB90A">
             <wp:extent cx="1143000" cy="1143000"/>
             <wp:effectExtent l="0" t="0" r="0" b="0"/>
             <wp:docPr id="1" name="icon" descr="Ikon aplikasi Yaping" title="Ikon Yaping"/>
@@ -120,7 +120,7 @@
           <w:left w:w="10" w:type="dxa"/>
           <w:right w:w="10" w:type="dxa"/>
         </w:tblCellMar>
-        <w:tblLook w:val="04A0" w:firstRow="1" w:lastRow="0" w:firstColumn="1" w:lastColumn="0" w:noHBand="0" w:noVBand="1"/>
+        <w:tblLook w:val="0000" w:firstRow="0" w:lastRow="0" w:firstColumn="0" w:lastColumn="0" w:noHBand="0" w:noVBand="0"/>
       </w:tblPr>
       <w:tblGrid>
         <w:gridCol w:w="2792"/>
@@ -265,7 +265,7 @@
                 <w:sz w:val="19"/>
                 <w:szCs w:val="19"/>
               </w:rPr>
-              <w:t>1.0 (perbaikan penyimpanan API key, 11 Oktober 2026)</w:t>
+              <w:t>1.0.1 (11 Oktober 2026)</w:t>
             </w:r>
           </w:p>
         </w:tc>
@@ -650,7 +650,7 @@
     <w:sdt>
       <w:sdtPr>
         <w:alias w:val="Daftar Isi"/>
-        <w:id w:val="-148915310"/>
+        <w:id w:val="1103849235"/>
       </w:sdtPr>
       <w:sdtEndPr/>
       <w:sdtContent>
@@ -673,7 +673,7 @@
           <w:r>
             <w:fldChar w:fldCharType="separate"/>
           </w:r>
-          <w:hyperlink w:anchor="_Toc242630153" w:history="1">
+          <w:hyperlink w:anchor="_Toc242630341" w:history="1">
             <w:r>
               <w:rPr>
                 <w:rStyle w:val="Hyperlink"/>
@@ -697,7 +697,7 @@
               <w:rPr>
                 <w:noProof/>
               </w:rPr>
-              <w:instrText xml:space="preserve"> PAGEREF _Toc242630153 \h </w:instrText>
+              <w:instrText xml:space="preserve"> PAGEREF _Toc242630341 \h </w:instrText>
             </w:r>
             <w:r>
               <w:rPr>
@@ -734,7 +734,7 @@
               <w:noProof/>
             </w:rPr>
           </w:pPr>
-          <w:hyperlink w:anchor="_Toc242630154" w:history="1">
+          <w:hyperlink w:anchor="_Toc242630342" w:history="1">
             <w:r>
               <w:rPr>
                 <w:rStyle w:val="Hyperlink"/>
@@ -758,7 +758,7 @@
               <w:rPr>
                 <w:noProof/>
               </w:rPr>
-              <w:instrText xml:space="preserve"> PAGEREF _Toc242630154 \h </w:instrText>
+              <w:instrText xml:space="preserve"> PAGEREF _Toc242630342 \h </w:instrText>
             </w:r>
             <w:r>
               <w:rPr>
@@ -795,7 +795,7 @@
               <w:noProof/>
             </w:rPr>
           </w:pPr>
-          <w:hyperlink w:anchor="_Toc242630155" w:history="1">
+          <w:hyperlink w:anchor="_Toc242630343" w:history="1">
             <w:r>
               <w:rPr>
                 <w:rStyle w:val="Hyperlink"/>
@@ -819,7 +819,7 @@
               <w:rPr>
                 <w:noProof/>
               </w:rPr>
-              <w:instrText xml:space="preserve"> PAGEREF _Toc242630155 \h </w:instrText>
+              <w:instrText xml:space="preserve"> PAGEREF _Toc242630343 \h </w:instrText>
             </w:r>
             <w:r>
               <w:rPr>
@@ -856,7 +856,7 @@
               <w:noProof/>
             </w:rPr>
           </w:pPr>
-          <w:hyperlink w:anchor="_Toc242630156" w:history="1">
+          <w:hyperlink w:anchor="_Toc242630344" w:history="1">
             <w:r>
               <w:rPr>
                 <w:rStyle w:val="Hyperlink"/>
@@ -880,7 +880,7 @@
               <w:rPr>
                 <w:noProof/>
               </w:rPr>
-              <w:instrText xml:space="preserve"> PAGEREF _Toc242630156 \h </w:instrText>
+              <w:instrText xml:space="preserve"> PAGEREF _Toc242630344 \h </w:instrText>
             </w:r>
             <w:r>
               <w:rPr>
@@ -917,7 +917,7 @@
               <w:noProof/>
             </w:rPr>
           </w:pPr>
-          <w:hyperlink w:anchor="_Toc242630157" w:history="1">
+          <w:hyperlink w:anchor="_Toc242630345" w:history="1">
             <w:r>
               <w:rPr>
                 <w:rStyle w:val="Hyperlink"/>
@@ -941,7 +941,7 @@
               <w:rPr>
                 <w:noProof/>
               </w:rPr>
-              <w:instrText xml:space="preserve"> PAGEREF _Toc242630157 \h </w:instrText>
+              <w:instrText xml:space="preserve"> PAGEREF _Toc242630345 \h </w:instrText>
             </w:r>
             <w:r>
               <w:rPr>
@@ -978,7 +978,7 @@
               <w:noProof/>
             </w:rPr>
           </w:pPr>
-          <w:hyperlink w:anchor="_Toc242630158" w:history="1">
+          <w:hyperlink w:anchor="_Toc242630346" w:history="1">
             <w:r>
               <w:rPr>
                 <w:rStyle w:val="Hyperlink"/>
@@ -1002,7 +1002,7 @@
               <w:rPr>
                 <w:noProof/>
               </w:rPr>
-              <w:instrText xml:space="preserve"> PAGEREF _Toc242630158 \h </w:instrText>
+              <w:instrText xml:space="preserve"> PAGEREF _Toc242630346 \h </w:instrText>
             </w:r>
             <w:r>
               <w:rPr>
@@ -1039,7 +1039,7 @@
               <w:noProof/>
             </w:rPr>
           </w:pPr>
-          <w:hyperlink w:anchor="_Toc242630159" w:history="1">
+          <w:hyperlink w:anchor="_Toc242630347" w:history="1">
             <w:r>
               <w:rPr>
                 <w:rStyle w:val="Hyperlink"/>
@@ -1063,7 +1063,7 @@
               <w:rPr>
                 <w:noProof/>
               </w:rPr>
-              <w:instrText xml:space="preserve"> PAGEREF _Toc242630159 \h </w:instrText>
+              <w:instrText xml:space="preserve"> PAGEREF _Toc242630347 \h </w:instrText>
             </w:r>
             <w:r>
               <w:rPr>
@@ -1100,7 +1100,7 @@
               <w:noProof/>
             </w:rPr>
           </w:pPr>
-          <w:hyperlink w:anchor="_Toc242630160" w:history="1">
+          <w:hyperlink w:anchor="_Toc242630348" w:history="1">
             <w:r>
               <w:rPr>
                 <w:rStyle w:val="Hyperlink"/>
@@ -1124,7 +1124,7 @@
               <w:rPr>
                 <w:noProof/>
               </w:rPr>
-              <w:instrText xml:space="preserve"> PAGEREF _Toc242630160 \h </w:instrText>
+              <w:instrText xml:space="preserve"> PAGEREF _Toc242630348 \h </w:instrText>
             </w:r>
             <w:r>
               <w:rPr>
@@ -1161,7 +1161,7 @@
               <w:noProof/>
             </w:rPr>
           </w:pPr>
-          <w:hyperlink w:anchor="_Toc242630161" w:history="1">
+          <w:hyperlink w:anchor="_Toc242630349" w:history="1">
             <w:r>
               <w:rPr>
                 <w:rStyle w:val="Hyperlink"/>
@@ -1185,7 +1185,7 @@
               <w:rPr>
                 <w:noProof/>
               </w:rPr>
-              <w:instrText xml:space="preserve"> PAGEREF _Toc242630161 \h </w:instrText>
+              <w:instrText xml:space="preserve"> PAGEREF _Toc242630349 \h </w:instrText>
             </w:r>
             <w:r>
               <w:rPr>
@@ -1222,7 +1222,7 @@
               <w:noProof/>
             </w:rPr>
           </w:pPr>
-          <w:hyperlink w:anchor="_Toc242630162" w:history="1">
+          <w:hyperlink w:anchor="_Toc242630350" w:history="1">
             <w:r>
               <w:rPr>
                 <w:rStyle w:val="Hyperlink"/>
@@ -1246,7 +1246,7 @@
               <w:rPr>
                 <w:noProof/>
               </w:rPr>
-              <w:instrText xml:space="preserve"> PAGEREF _Toc242630162 \h </w:instrText>
+              <w:instrText xml:space="preserve"> PAGEREF _Toc242630350 \h </w:instrText>
             </w:r>
             <w:r>
               <w:rPr>
@@ -1283,7 +1283,7 @@
               <w:noProof/>
             </w:rPr>
           </w:pPr>
-          <w:hyperlink w:anchor="_Toc242630163" w:history="1">
+          <w:hyperlink w:anchor="_Toc242630351" w:history="1">
             <w:r>
               <w:rPr>
                 <w:rStyle w:val="Hyperlink"/>
@@ -1307,7 +1307,7 @@
               <w:rPr>
                 <w:noProof/>
               </w:rPr>
-              <w:instrText xml:space="preserve"> PAGEREF _Toc242630163 \h </w:instrText>
+              <w:instrText xml:space="preserve"> PAGEREF _Toc242630351 \h </w:instrText>
             </w:r>
             <w:r>
               <w:rPr>
@@ -1344,7 +1344,7 @@
               <w:noProof/>
             </w:rPr>
           </w:pPr>
-          <w:hyperlink w:anchor="_Toc242630164" w:history="1">
+          <w:hyperlink w:anchor="_Toc242630352" w:history="1">
             <w:r>
               <w:rPr>
                 <w:rStyle w:val="Hyperlink"/>
@@ -1368,7 +1368,7 @@
               <w:rPr>
                 <w:noProof/>
               </w:rPr>
-              <w:instrText xml:space="preserve"> PAGEREF _Toc242630164 \h </w:instrText>
+              <w:instrText xml:space="preserve"> PAGEREF _Toc242630352 \h </w:instrText>
             </w:r>
             <w:r>
               <w:rPr>
@@ -1405,7 +1405,7 @@
               <w:noProof/>
             </w:rPr>
           </w:pPr>
-          <w:hyperlink w:anchor="_Toc242630165" w:history="1">
+          <w:hyperlink w:anchor="_Toc242630353" w:history="1">
             <w:r>
               <w:rPr>
                 <w:rStyle w:val="Hyperlink"/>
@@ -1429,7 +1429,7 @@
               <w:rPr>
                 <w:noProof/>
               </w:rPr>
-              <w:instrText xml:space="preserve"> PAGEREF _Toc242630165 \h </w:instrText>
+              <w:instrText xml:space="preserve"> PAGEREF _Toc242630353 \h </w:instrText>
             </w:r>
             <w:r>
               <w:rPr>
@@ -1466,7 +1466,7 @@
               <w:noProof/>
             </w:rPr>
           </w:pPr>
-          <w:hyperlink w:anchor="_Toc242630166" w:history="1">
+          <w:hyperlink w:anchor="_Toc242630354" w:history="1">
             <w:r>
               <w:rPr>
                 <w:rStyle w:val="Hyperlink"/>
@@ -1490,7 +1490,7 @@
               <w:rPr>
                 <w:noProof/>
               </w:rPr>
-              <w:instrText xml:space="preserve"> PAGEREF _Toc242630166 \h </w:instrText>
+              <w:instrText xml:space="preserve"> PAGEREF _Toc242630354 \h </w:instrText>
             </w:r>
             <w:r>
               <w:rPr>
@@ -1527,7 +1527,7 @@
               <w:noProof/>
             </w:rPr>
           </w:pPr>
-          <w:hyperlink w:anchor="_Toc242630167" w:history="1">
+          <w:hyperlink w:anchor="_Toc242630355" w:history="1">
             <w:r>
               <w:rPr>
                 <w:rStyle w:val="Hyperlink"/>
@@ -1551,7 +1551,7 @@
               <w:rPr>
                 <w:noProof/>
               </w:rPr>
-              <w:instrText xml:space="preserve"> PAGEREF _Toc242630167 \h </w:instrText>
+              <w:instrText xml:space="preserve"> PAGEREF _Toc242630355 \h </w:instrText>
             </w:r>
             <w:r>
               <w:rPr>
@@ -1588,7 +1588,7 @@
               <w:noProof/>
             </w:rPr>
           </w:pPr>
-          <w:hyperlink w:anchor="_Toc242630168" w:history="1">
+          <w:hyperlink w:anchor="_Toc242630356" w:history="1">
             <w:r>
               <w:rPr>
                 <w:rStyle w:val="Hyperlink"/>
@@ -1612,7 +1612,7 @@
               <w:rPr>
                 <w:noProof/>
               </w:rPr>
-              <w:instrText xml:space="preserve"> PAGEREF _Toc242630168 \h </w:instrText>
+              <w:instrText xml:space="preserve"> PAGEREF _Toc242630356 \h </w:instrText>
             </w:r>
             <w:r>
               <w:rPr>
@@ -1649,7 +1649,7 @@
               <w:noProof/>
             </w:rPr>
           </w:pPr>
-          <w:hyperlink w:anchor="_Toc242630169" w:history="1">
+          <w:hyperlink w:anchor="_Toc242630357" w:history="1">
             <w:r>
               <w:rPr>
                 <w:rStyle w:val="Hyperlink"/>
@@ -1673,7 +1673,7 @@
               <w:rPr>
                 <w:noProof/>
               </w:rPr>
-              <w:instrText xml:space="preserve"> PAGEREF _Toc242630169 \h </w:instrText>
+              <w:instrText xml:space="preserve"> PAGEREF _Toc242630357 \h </w:instrText>
             </w:r>
             <w:r>
               <w:rPr>
@@ -1710,7 +1710,7 @@
               <w:noProof/>
             </w:rPr>
           </w:pPr>
-          <w:hyperlink w:anchor="_Toc242630170" w:history="1">
+          <w:hyperlink w:anchor="_Toc242630358" w:history="1">
             <w:r>
               <w:rPr>
                 <w:rStyle w:val="Hyperlink"/>
@@ -1734,7 +1734,7 @@
               <w:rPr>
                 <w:noProof/>
               </w:rPr>
-              <w:instrText xml:space="preserve"> PAGEREF _Toc242630170 \h </w:instrText>
+              <w:instrText xml:space="preserve"> PAGEREF _Toc242630358 \h </w:instrText>
             </w:r>
             <w:r>
               <w:rPr>
@@ -1771,7 +1771,7 @@
               <w:noProof/>
             </w:rPr>
           </w:pPr>
-          <w:hyperlink w:anchor="_Toc242630171" w:history="1">
+          <w:hyperlink w:anchor="_Toc242630359" w:history="1">
             <w:r>
               <w:rPr>
                 <w:rStyle w:val="Hyperlink"/>
@@ -1795,7 +1795,7 @@
               <w:rPr>
                 <w:noProof/>
               </w:rPr>
-              <w:instrText xml:space="preserve"> PAGEREF _Toc242630171 \h </w:instrText>
+              <w:instrText xml:space="preserve"> PAGEREF _Toc242630359 \h </w:instrText>
             </w:r>
             <w:r>
               <w:rPr>
@@ -1832,7 +1832,7 @@
               <w:noProof/>
             </w:rPr>
           </w:pPr>
-          <w:hyperlink w:anchor="_Toc242630172" w:history="1">
+          <w:hyperlink w:anchor="_Toc242630360" w:history="1">
             <w:r>
               <w:rPr>
                 <w:rStyle w:val="Hyperlink"/>
@@ -1856,7 +1856,7 @@
               <w:rPr>
                 <w:noProof/>
               </w:rPr>
-              <w:instrText xml:space="preserve"> PAGEREF _Toc242630172 \h </w:instrText>
+              <w:instrText xml:space="preserve"> PAGEREF _Toc242630360 \h </w:instrText>
             </w:r>
             <w:r>
               <w:rPr>
@@ -1893,7 +1893,7 @@
               <w:noProof/>
             </w:rPr>
           </w:pPr>
-          <w:hyperlink w:anchor="_Toc242630173" w:history="1">
+          <w:hyperlink w:anchor="_Toc242630361" w:history="1">
             <w:r>
               <w:rPr>
                 <w:rStyle w:val="Hyperlink"/>
@@ -1917,7 +1917,7 @@
               <w:rPr>
                 <w:noProof/>
               </w:rPr>
-              <w:instrText xml:space="preserve"> PAGEREF _Toc242630173 \h </w:instrText>
+              <w:instrText xml:space="preserve"> PAGEREF _Toc242630361 \h </w:instrText>
             </w:r>
             <w:r>
               <w:rPr>
@@ -1954,7 +1954,7 @@
               <w:noProof/>
             </w:rPr>
           </w:pPr>
-          <w:hyperlink w:anchor="_Toc242630174" w:history="1">
+          <w:hyperlink w:anchor="_Toc242630362" w:history="1">
             <w:r>
               <w:rPr>
                 <w:rStyle w:val="Hyperlink"/>
@@ -1978,7 +1978,7 @@
               <w:rPr>
                 <w:noProof/>
               </w:rPr>
-              <w:instrText xml:space="preserve"> PAGEREF _Toc242630174 \h </w:instrText>
+              <w:instrText xml:space="preserve"> PAGEREF _Toc242630362 \h </w:instrText>
             </w:r>
             <w:r>
               <w:rPr>
@@ -2015,7 +2015,7 @@
               <w:noProof/>
             </w:rPr>
           </w:pPr>
-          <w:hyperlink w:anchor="_Toc242630175" w:history="1">
+          <w:hyperlink w:anchor="_Toc242630363" w:history="1">
             <w:r>
               <w:rPr>
                 <w:rStyle w:val="Hyperlink"/>
@@ -2039,7 +2039,7 @@
               <w:rPr>
                 <w:noProof/>
               </w:rPr>
-              <w:instrText xml:space="preserve"> PAGEREF _Toc242630175 \h </w:instrText>
+              <w:instrText xml:space="preserve"> PAGEREF _Toc242630363 \h </w:instrText>
             </w:r>
             <w:r>
               <w:rPr>
@@ -2076,7 +2076,7 @@
               <w:noProof/>
             </w:rPr>
           </w:pPr>
-          <w:hyperlink w:anchor="_Toc242630176" w:history="1">
+          <w:hyperlink w:anchor="_Toc242630364" w:history="1">
             <w:r>
               <w:rPr>
                 <w:rStyle w:val="Hyperlink"/>
@@ -2100,7 +2100,7 @@
               <w:rPr>
                 <w:noProof/>
               </w:rPr>
-              <w:instrText xml:space="preserve"> PAGEREF _Toc242630176 \h </w:instrText>
+              <w:instrText xml:space="preserve"> PAGEREF _Toc242630364 \h </w:instrText>
             </w:r>
             <w:r>
               <w:rPr>
@@ -2137,7 +2137,7 @@
               <w:noProof/>
             </w:rPr>
           </w:pPr>
-          <w:hyperlink w:anchor="_Toc242630177" w:history="1">
+          <w:hyperlink w:anchor="_Toc242630365" w:history="1">
             <w:r>
               <w:rPr>
                 <w:rStyle w:val="Hyperlink"/>
@@ -2161,7 +2161,7 @@
               <w:rPr>
                 <w:noProof/>
               </w:rPr>
-              <w:instrText xml:space="preserve"> PAGEREF _Toc242630177 \h </w:instrText>
+              <w:instrText xml:space="preserve"> PAGEREF _Toc242630365 \h </w:instrText>
             </w:r>
             <w:r>
               <w:rPr>
@@ -2198,7 +2198,7 @@
               <w:noProof/>
             </w:rPr>
           </w:pPr>
-          <w:hyperlink w:anchor="_Toc242630178" w:history="1">
+          <w:hyperlink w:anchor="_Toc242630366" w:history="1">
             <w:r>
               <w:rPr>
                 <w:rStyle w:val="Hyperlink"/>
@@ -2222,7 +2222,7 @@
               <w:rPr>
                 <w:noProof/>
               </w:rPr>
-              <w:instrText xml:space="preserve"> PAGEREF _Toc242630178 \h </w:instrText>
+              <w:instrText xml:space="preserve"> PAGEREF _Toc242630366 \h </w:instrText>
             </w:r>
             <w:r>
               <w:rPr>
@@ -2259,7 +2259,7 @@
               <w:noProof/>
             </w:rPr>
           </w:pPr>
-          <w:hyperlink w:anchor="_Toc242630179" w:history="1">
+          <w:hyperlink w:anchor="_Toc242630367" w:history="1">
             <w:r>
               <w:rPr>
                 <w:rStyle w:val="Hyperlink"/>
@@ -2283,7 +2283,7 @@
               <w:rPr>
                 <w:noProof/>
               </w:rPr>
-              <w:instrText xml:space="preserve"> PAGEREF _Toc242630179 \h </w:instrText>
+              <w:instrText xml:space="preserve"> PAGEREF _Toc242630367 \h </w:instrText>
             </w:r>
             <w:r>
               <w:rPr>
@@ -2320,7 +2320,7 @@
               <w:noProof/>
             </w:rPr>
           </w:pPr>
-          <w:hyperlink w:anchor="_Toc242630180" w:history="1">
+          <w:hyperlink w:anchor="_Toc242630368" w:history="1">
             <w:r>
               <w:rPr>
                 <w:rStyle w:val="Hyperlink"/>
@@ -2344,7 +2344,7 @@
               <w:rPr>
                 <w:noProof/>
               </w:rPr>
-              <w:instrText xml:space="preserve"> PAGEREF _Toc242630180 \h </w:instrText>
+              <w:instrText xml:space="preserve"> PAGEREF _Toc242630368 \h </w:instrText>
             </w:r>
             <w:r>
               <w:rPr>
@@ -2381,7 +2381,7 @@
               <w:noProof/>
             </w:rPr>
           </w:pPr>
-          <w:hyperlink w:anchor="_Toc242630181" w:history="1">
+          <w:hyperlink w:anchor="_Toc242630369" w:history="1">
             <w:r>
               <w:rPr>
                 <w:rStyle w:val="Hyperlink"/>
@@ -2405,7 +2405,7 @@
               <w:rPr>
                 <w:noProof/>
               </w:rPr>
-              <w:instrText xml:space="preserve"> PAGEREF _Toc242630181 \h </w:instrText>
+              <w:instrText xml:space="preserve"> PAGEREF _Toc242630369 \h </w:instrText>
             </w:r>
             <w:r>
               <w:rPr>
@@ -2442,7 +2442,7 @@
               <w:noProof/>
             </w:rPr>
           </w:pPr>
-          <w:hyperlink w:anchor="_Toc242630182" w:history="1">
+          <w:hyperlink w:anchor="_Toc242630370" w:history="1">
             <w:r>
               <w:rPr>
                 <w:rStyle w:val="Hyperlink"/>
@@ -2466,7 +2466,7 @@
               <w:rPr>
                 <w:noProof/>
               </w:rPr>
-              <w:instrText xml:space="preserve"> PAGEREF _Toc242630182 \h </w:instrText>
+              <w:instrText xml:space="preserve"> PAGEREF _Toc242630370 \h </w:instrText>
             </w:r>
             <w:r>
               <w:rPr>
@@ -2503,7 +2503,7 @@
               <w:noProof/>
             </w:rPr>
           </w:pPr>
-          <w:hyperlink w:anchor="_Toc242630183" w:history="1">
+          <w:hyperlink w:anchor="_Toc242630371" w:history="1">
             <w:r>
               <w:rPr>
                 <w:rStyle w:val="Hyperlink"/>
@@ -2527,7 +2527,7 @@
               <w:rPr>
                 <w:noProof/>
               </w:rPr>
-              <w:instrText xml:space="preserve"> PAGEREF _Toc242630183 \h </w:instrText>
+              <w:instrText xml:space="preserve"> PAGEREF _Toc242630371 \h </w:instrText>
             </w:r>
             <w:r>
               <w:rPr>
@@ -2564,7 +2564,7 @@
               <w:noProof/>
             </w:rPr>
           </w:pPr>
-          <w:hyperlink w:anchor="_Toc242630184" w:history="1">
+          <w:hyperlink w:anchor="_Toc242630372" w:history="1">
             <w:r>
               <w:rPr>
                 <w:rStyle w:val="Hyperlink"/>
@@ -2588,7 +2588,7 @@
               <w:rPr>
                 <w:noProof/>
               </w:rPr>
-              <w:instrText xml:space="preserve"> PAGEREF _Toc242630184 \h </w:instrText>
+              <w:instrText xml:space="preserve"> PAGEREF _Toc242630372 \h </w:instrText>
             </w:r>
             <w:r>
               <w:rPr>
@@ -2625,7 +2625,7 @@
               <w:noProof/>
             </w:rPr>
           </w:pPr>
-          <w:hyperlink w:anchor="_Toc242630185" w:history="1">
+          <w:hyperlink w:anchor="_Toc242630373" w:history="1">
             <w:r>
               <w:rPr>
                 <w:rStyle w:val="Hyperlink"/>
@@ -2649,7 +2649,7 @@
               <w:rPr>
                 <w:noProof/>
               </w:rPr>
-              <w:instrText xml:space="preserve"> PAGEREF _Toc242630185 \h </w:instrText>
+              <w:instrText xml:space="preserve"> PAGEREF _Toc242630373 \h </w:instrText>
             </w:r>
             <w:r>
               <w:rPr>
@@ -2686,7 +2686,7 @@
               <w:noProof/>
             </w:rPr>
           </w:pPr>
-          <w:hyperlink w:anchor="_Toc242630186" w:history="1">
+          <w:hyperlink w:anchor="_Toc242630374" w:history="1">
             <w:r>
               <w:rPr>
                 <w:rStyle w:val="Hyperlink"/>
@@ -2710,7 +2710,7 @@
               <w:rPr>
                 <w:noProof/>
               </w:rPr>
-              <w:instrText xml:space="preserve"> PAGEREF _Toc242630186 \h </w:instrText>
+              <w:instrText xml:space="preserve"> PAGEREF _Toc242630374 \h </w:instrText>
             </w:r>
             <w:r>
               <w:rPr>
@@ -2747,7 +2747,7 @@
               <w:noProof/>
             </w:rPr>
           </w:pPr>
-          <w:hyperlink w:anchor="_Toc242630187" w:history="1">
+          <w:hyperlink w:anchor="_Toc242630375" w:history="1">
             <w:r>
               <w:rPr>
                 <w:rStyle w:val="Hyperlink"/>
@@ -2771,7 +2771,7 @@
               <w:rPr>
                 <w:noProof/>
               </w:rPr>
-              <w:instrText xml:space="preserve"> PAGEREF _Toc242630187 \h </w:instrText>
+              <w:instrText xml:space="preserve"> PAGEREF _Toc242630375 \h </w:instrText>
             </w:r>
             <w:r>
               <w:rPr>
@@ -2808,7 +2808,7 @@
               <w:noProof/>
             </w:rPr>
           </w:pPr>
-          <w:hyperlink w:anchor="_Toc242630188" w:history="1">
+          <w:hyperlink w:anchor="_Toc242630376" w:history="1">
             <w:r>
               <w:rPr>
                 <w:rStyle w:val="Hyperlink"/>
@@ -2832,7 +2832,7 @@
               <w:rPr>
                 <w:noProof/>
               </w:rPr>
-              <w:instrText xml:space="preserve"> PAGEREF _Toc242630188 \h </w:instrText>
+              <w:instrText xml:space="preserve"> PAGEREF _Toc242630376 \h </w:instrText>
             </w:r>
             <w:r>
               <w:rPr>
@@ -2869,7 +2869,7 @@
               <w:noProof/>
             </w:rPr>
           </w:pPr>
-          <w:hyperlink w:anchor="_Toc242630189" w:history="1">
+          <w:hyperlink w:anchor="_Toc242630377" w:history="1">
             <w:r>
               <w:rPr>
                 <w:rStyle w:val="Hyperlink"/>
@@ -2893,7 +2893,7 @@
               <w:rPr>
                 <w:noProof/>
               </w:rPr>
-              <w:instrText xml:space="preserve"> PAGEREF _Toc242630189 \h </w:instrText>
+              <w:instrText xml:space="preserve"> PAGEREF _Toc242630377 \h </w:instrText>
             </w:r>
             <w:r>
               <w:rPr>
@@ -2930,7 +2930,7 @@
               <w:noProof/>
             </w:rPr>
           </w:pPr>
-          <w:hyperlink w:anchor="_Toc242630190" w:history="1">
+          <w:hyperlink w:anchor="_Toc242630378" w:history="1">
             <w:r>
               <w:rPr>
                 <w:rStyle w:val="Hyperlink"/>
@@ -2954,7 +2954,7 @@
               <w:rPr>
                 <w:noProof/>
               </w:rPr>
-              <w:instrText xml:space="preserve"> PAGEREF _Toc242630190 \h </w:instrText>
+              <w:instrText xml:space="preserve"> PAGEREF _Toc242630378 \h </w:instrText>
             </w:r>
             <w:r>
               <w:rPr>
@@ -2991,7 +2991,7 @@
               <w:noProof/>
             </w:rPr>
           </w:pPr>
-          <w:hyperlink w:anchor="_Toc242630191" w:history="1">
+          <w:hyperlink w:anchor="_Toc242630379" w:history="1">
             <w:r>
               <w:rPr>
                 <w:rStyle w:val="Hyperlink"/>
@@ -3015,7 +3015,7 @@
               <w:rPr>
                 <w:noProof/>
               </w:rPr>
-              <w:instrText xml:space="preserve"> PAGEREF _Toc242630191 \h </w:instrText>
+              <w:instrText xml:space="preserve"> PAGEREF _Toc242630379 \h </w:instrText>
             </w:r>
             <w:r>
               <w:rPr>
@@ -3052,7 +3052,7 @@
               <w:noProof/>
             </w:rPr>
           </w:pPr>
-          <w:hyperlink w:anchor="_Toc242630192" w:history="1">
+          <w:hyperlink w:anchor="_Toc242630380" w:history="1">
             <w:r>
               <w:rPr>
                 <w:rStyle w:val="Hyperlink"/>
@@ -3076,7 +3076,7 @@
               <w:rPr>
                 <w:noProof/>
               </w:rPr>
-              <w:instrText xml:space="preserve"> PAGEREF _Toc242630192 \h </w:instrText>
+              <w:instrText xml:space="preserve"> PAGEREF _Toc242630380 \h </w:instrText>
             </w:r>
             <w:r>
               <w:rPr>
@@ -3113,7 +3113,7 @@
               <w:noProof/>
             </w:rPr>
           </w:pPr>
-          <w:hyperlink w:anchor="_Toc242630193" w:history="1">
+          <w:hyperlink w:anchor="_Toc242630381" w:history="1">
             <w:r>
               <w:rPr>
                 <w:rStyle w:val="Hyperlink"/>
@@ -3137,7 +3137,7 @@
               <w:rPr>
                 <w:noProof/>
               </w:rPr>
-              <w:instrText xml:space="preserve"> PAGEREF _Toc242630193 \h </w:instrText>
+              <w:instrText xml:space="preserve"> PAGEREF _Toc242630381 \h </w:instrText>
             </w:r>
             <w:r>
               <w:rPr>
@@ -3174,7 +3174,7 @@
               <w:noProof/>
             </w:rPr>
           </w:pPr>
-          <w:hyperlink w:anchor="_Toc242630194" w:history="1">
+          <w:hyperlink w:anchor="_Toc242630382" w:history="1">
             <w:r>
               <w:rPr>
                 <w:rStyle w:val="Hyperlink"/>
@@ -3198,7 +3198,7 @@
               <w:rPr>
                 <w:noProof/>
               </w:rPr>
-              <w:instrText xml:space="preserve"> PAGEREF _Toc242630194 \h </w:instrText>
+              <w:instrText xml:space="preserve"> PAGEREF _Toc242630382 \h </w:instrText>
             </w:r>
             <w:r>
               <w:rPr>
@@ -3235,7 +3235,7 @@
               <w:noProof/>
             </w:rPr>
           </w:pPr>
-          <w:hyperlink w:anchor="_Toc242630195" w:history="1">
+          <w:hyperlink w:anchor="_Toc242630383" w:history="1">
             <w:r>
               <w:rPr>
                 <w:rStyle w:val="Hyperlink"/>
@@ -3259,7 +3259,7 @@
               <w:rPr>
                 <w:noProof/>
               </w:rPr>
-              <w:instrText xml:space="preserve"> PAGEREF _Toc242630195 \h </w:instrText>
+              <w:instrText xml:space="preserve"> PAGEREF _Toc242630383 \h </w:instrText>
             </w:r>
             <w:r>
               <w:rPr>
@@ -3296,7 +3296,7 @@
               <w:noProof/>
             </w:rPr>
           </w:pPr>
-          <w:hyperlink w:anchor="_Toc242630196" w:history="1">
+          <w:hyperlink w:anchor="_Toc242630384" w:history="1">
             <w:r>
               <w:rPr>
                 <w:rStyle w:val="Hyperlink"/>
@@ -3320,7 +3320,7 @@
               <w:rPr>
                 <w:noProof/>
               </w:rPr>
-              <w:instrText xml:space="preserve"> PAGEREF _Toc242630196 \h </w:instrText>
+              <w:instrText xml:space="preserve"> PAGEREF _Toc242630384 \h </w:instrText>
             </w:r>
             <w:r>
               <w:rPr>
@@ -3357,7 +3357,7 @@
               <w:noProof/>
             </w:rPr>
           </w:pPr>
-          <w:hyperlink w:anchor="_Toc242630197" w:history="1">
+          <w:hyperlink w:anchor="_Toc242630385" w:history="1">
             <w:r>
               <w:rPr>
                 <w:rStyle w:val="Hyperlink"/>
@@ -3381,7 +3381,7 @@
               <w:rPr>
                 <w:noProof/>
               </w:rPr>
-              <w:instrText xml:space="preserve"> PAGEREF _Toc242630197 \h </w:instrText>
+              <w:instrText xml:space="preserve"> PAGEREF _Toc242630385 \h </w:instrText>
             </w:r>
             <w:r>
               <w:rPr>
@@ -3418,7 +3418,7 @@
               <w:noProof/>
             </w:rPr>
           </w:pPr>
-          <w:hyperlink w:anchor="_Toc242630198" w:history="1">
+          <w:hyperlink w:anchor="_Toc242630386" w:history="1">
             <w:r>
               <w:rPr>
                 <w:rStyle w:val="Hyperlink"/>
@@ -3442,7 +3442,7 @@
               <w:rPr>
                 <w:noProof/>
               </w:rPr>
-              <w:instrText xml:space="preserve"> PAGEREF _Toc242630198 \h </w:instrText>
+              <w:instrText xml:space="preserve"> PAGEREF _Toc242630386 \h </w:instrText>
             </w:r>
             <w:r>
               <w:rPr>
@@ -3479,7 +3479,7 @@
               <w:noProof/>
             </w:rPr>
           </w:pPr>
-          <w:hyperlink w:anchor="_Toc242630199" w:history="1">
+          <w:hyperlink w:anchor="_Toc242630387" w:history="1">
             <w:r>
               <w:rPr>
                 <w:rStyle w:val="Hyperlink"/>
@@ -3503,7 +3503,7 @@
               <w:rPr>
                 <w:noProof/>
               </w:rPr>
-              <w:instrText xml:space="preserve"> PAGEREF _Toc242630199 \h </w:instrText>
+              <w:instrText xml:space="preserve"> PAGEREF _Toc242630387 \h </w:instrText>
             </w:r>
             <w:r>
               <w:rPr>
@@ -3542,7 +3542,7 @@
         <w:pStyle w:val="Heading1"/>
         <w:pageBreakBefore/>
       </w:pPr>
-      <w:bookmarkStart w:id="0" w:name="_Toc242630153"/>
+      <w:bookmarkStart w:id="0" w:name="_Toc242630341"/>
       <w:r>
         <w:lastRenderedPageBreak/>
         <w:t>1. Ringkasan</w:t>
@@ -3598,7 +3598,7 @@
         <w:keepNext/>
         <w:keepLines/>
       </w:pPr>
-      <w:bookmarkStart w:id="1" w:name="_Toc242630154"/>
+      <w:bookmarkStart w:id="1" w:name="_Toc242630342"/>
       <w:r>
         <w:t>1.1 Sorotan</w:t>
       </w:r>
@@ -3619,7 +3619,7 @@
           <w:left w:w="10" w:type="dxa"/>
           <w:right w:w="10" w:type="dxa"/>
         </w:tblCellMar>
-        <w:tblLook w:val="04A0" w:firstRow="1" w:lastRow="0" w:firstColumn="1" w:lastColumn="0" w:noHBand="0" w:noVBand="1"/>
+        <w:tblLook w:val="0000" w:firstRow="0" w:lastRow="0" w:firstColumn="0" w:lastColumn="0" w:noHBand="0" w:noVBand="0"/>
       </w:tblPr>
       <w:tblGrid>
         <w:gridCol w:w="2606"/>
@@ -4217,7 +4217,7 @@
         <w:keepNext/>
         <w:keepLines/>
       </w:pPr>
-      <w:bookmarkStart w:id="2" w:name="_Toc242630155"/>
+      <w:bookmarkStart w:id="2" w:name="_Toc242630343"/>
       <w:r>
         <w:t>1.2 Untuk siapa dokumen ini</w:t>
       </w:r>
@@ -4288,7 +4288,7 @@
         <w:pStyle w:val="Heading1"/>
         <w:pageBreakBefore/>
       </w:pPr>
-      <w:bookmarkStart w:id="3" w:name="_Toc242630156"/>
+      <w:bookmarkStart w:id="3" w:name="_Toc242630344"/>
       <w:r>
         <w:lastRenderedPageBreak/>
         <w:t>2. Cara Menggunakan</w:t>
@@ -4301,7 +4301,7 @@
         <w:keepNext/>
         <w:keepLines/>
       </w:pPr>
-      <w:bookmarkStart w:id="4" w:name="_Toc242630157"/>
+      <w:bookmarkStart w:id="4" w:name="_Toc242630345"/>
       <w:r>
         <w:t>2.1 Kontrol utama</w:t>
       </w:r>
@@ -4322,7 +4322,7 @@
           <w:left w:w="10" w:type="dxa"/>
           <w:right w:w="10" w:type="dxa"/>
         </w:tblCellMar>
-        <w:tblLook w:val="04A0" w:firstRow="1" w:lastRow="0" w:firstColumn="1" w:lastColumn="0" w:noHBand="0" w:noVBand="1"/>
+        <w:tblLook w:val="0000" w:firstRow="0" w:lastRow="0" w:firstColumn="0" w:lastColumn="0" w:noHBand="0" w:noVBand="0"/>
       </w:tblPr>
       <w:tblGrid>
         <w:gridCol w:w="3909"/>
@@ -4826,7 +4826,7 @@
         <w:keepNext/>
         <w:keepLines/>
       </w:pPr>
-      <w:bookmarkStart w:id="5" w:name="_Toc242630158"/>
+      <w:bookmarkStart w:id="5" w:name="_Toc242630346"/>
       <w:r>
         <w:t>2.2 Indikator di layar</w:t>
       </w:r>
@@ -4847,7 +4847,7 @@
           <w:left w:w="10" w:type="dxa"/>
           <w:right w:w="10" w:type="dxa"/>
         </w:tblCellMar>
-        <w:tblLook w:val="04A0" w:firstRow="1" w:lastRow="0" w:firstColumn="1" w:lastColumn="0" w:noHBand="0" w:noVBand="1"/>
+        <w:tblLook w:val="0000" w:firstRow="0" w:lastRow="0" w:firstColumn="0" w:lastColumn="0" w:noHBand="0" w:noVBand="0"/>
       </w:tblPr>
       <w:tblGrid>
         <w:gridCol w:w="3722"/>
@@ -5220,7 +5220,7 @@
         <w:keepNext/>
         <w:keepLines/>
       </w:pPr>
-      <w:bookmarkStart w:id="6" w:name="_Toc242630159"/>
+      <w:bookmarkStart w:id="6" w:name="_Toc242630347"/>
       <w:r>
         <w:t>2.3 Menu bar dan Pengaturan</w:t>
       </w:r>
@@ -5259,7 +5259,7 @@
           <w:left w:w="10" w:type="dxa"/>
           <w:right w:w="10" w:type="dxa"/>
         </w:tblCellMar>
-        <w:tblLook w:val="04A0" w:firstRow="1" w:lastRow="0" w:firstColumn="1" w:lastColumn="0" w:noHBand="0" w:noVBand="1"/>
+        <w:tblLook w:val="0000" w:firstRow="0" w:lastRow="0" w:firstColumn="0" w:lastColumn="0" w:noHBand="0" w:noVBand="0"/>
       </w:tblPr>
       <w:tblGrid>
         <w:gridCol w:w="1675"/>
@@ -5632,7 +5632,7 @@
         <w:keepNext/>
         <w:keepLines/>
       </w:pPr>
-      <w:bookmarkStart w:id="7" w:name="_Toc242630160"/>
+      <w:bookmarkStart w:id="7" w:name="_Toc242630348"/>
       <w:r>
         <w:t>2.4 Pengaturan pertama kali</w:t>
       </w:r>
@@ -5657,7 +5657,7 @@
           <w:sz w:val="18"/>
           <w:szCs w:val="18"/>
         </w:rPr>
-        <w:t>Yaping-1.0.zip</w:t>
+        <w:t>Yaping-1.0.1.zip</w:t>
       </w:r>
       <w:r>
         <w:t xml:space="preserve"> dari halaman rilis GitHub, ekstrak, lalu pindahkan ke folder Applications.</w:t>
@@ -5758,7 +5758,7 @@
         <w:pStyle w:val="Heading1"/>
         <w:pageBreakBefore/>
       </w:pPr>
-      <w:bookmarkStart w:id="8" w:name="_Toc242630161"/>
+      <w:bookmarkStart w:id="8" w:name="_Toc242630349"/>
       <w:r>
         <w:lastRenderedPageBreak/>
         <w:t>3. Arsitektur Sistem</w:t>
@@ -5794,10 +5794,10 @@
           <w:noProof/>
         </w:rPr>
         <w:drawing>
-          <wp:inline distT="0" distB="0" distL="0" distR="0" wp14:anchorId="4A442A6A" wp14:editId="341C1341">
+          <wp:inline distT="0" distB="0" distL="0" distR="0" wp14:anchorId="7013AC71" wp14:editId="3DCB55F9">
             <wp:extent cx="5810250" cy="3657600"/>
             <wp:effectExtent l="0" t="0" r="0" b="0"/>
-            <wp:docPr id="190786199" name="fig1_arsitektur.png" descr="Arsitektur berlapis Yaping: antarmuka, kendali, pemrosesan, mesin transkripsi, dan penyimpanan." title="Arsitektur berlapis Yaping: antarmuka, kendali, pemrosesan, mesin transkripsi, dan penyimpanan."/>
+            <wp:docPr id="2007262678" name="fig1_arsitektur.png" descr="Arsitektur berlapis Yaping: antarmuka, kendali, pemrosesan, mesin transkripsi, dan penyimpanan." title="Arsitektur berlapis Yaping: antarmuka, kendali, pemrosesan, mesin transkripsi, dan penyimpanan."/>
             <wp:cNvGraphicFramePr>
               <a:graphicFrameLocks xmlns:a="http://schemas.openxmlformats.org/drawingml/2006/main" noChangeAspect="1"/>
             </wp:cNvGraphicFramePr>
@@ -5865,7 +5865,7 @@
         <w:keepNext/>
         <w:keepLines/>
       </w:pPr>
-      <w:bookmarkStart w:id="9" w:name="_Toc242630162"/>
+      <w:bookmarkStart w:id="9" w:name="_Toc242630350"/>
       <w:r>
         <w:t>3.1 Modul dan tanggung jawab</w:t>
       </w:r>
@@ -5886,7 +5886,7 @@
           <w:left w:w="10" w:type="dxa"/>
           <w:right w:w="10" w:type="dxa"/>
         </w:tblCellMar>
-        <w:tblLook w:val="04A0" w:firstRow="1" w:lastRow="0" w:firstColumn="1" w:lastColumn="0" w:noHBand="0" w:noVBand="1"/>
+        <w:tblLook w:val="0000" w:firstRow="0" w:lastRow="0" w:firstColumn="0" w:lastColumn="0" w:noHBand="0" w:noVBand="0"/>
       </w:tblPr>
       <w:tblGrid>
         <w:gridCol w:w="3071"/>
@@ -7813,7 +7813,7 @@
         <w:keepNext/>
         <w:keepLines/>
       </w:pPr>
-      <w:bookmarkStart w:id="10" w:name="_Toc242630163"/>
+      <w:bookmarkStart w:id="10" w:name="_Toc242630351"/>
       <w:r>
         <w:t>3.2 Tumpukan teknologi</w:t>
       </w:r>
@@ -7834,7 +7834,7 @@
           <w:left w:w="10" w:type="dxa"/>
           <w:right w:w="10" w:type="dxa"/>
         </w:tblCellMar>
-        <w:tblLook w:val="04A0" w:firstRow="1" w:lastRow="0" w:firstColumn="1" w:lastColumn="0" w:noHBand="0" w:noVBand="1"/>
+        <w:tblLook w:val="0000" w:firstRow="0" w:lastRow="0" w:firstColumn="0" w:lastColumn="0" w:noHBand="0" w:noVBand="0"/>
       </w:tblPr>
       <w:tblGrid>
         <w:gridCol w:w="2233"/>
@@ -9073,7 +9073,7 @@
         <w:pStyle w:val="Heading1"/>
         <w:pageBreakBefore/>
       </w:pPr>
-      <w:bookmarkStart w:id="11" w:name="_Toc242630164"/>
+      <w:bookmarkStart w:id="11" w:name="_Toc242630352"/>
       <w:r>
         <w:lastRenderedPageBreak/>
         <w:t>4. Alur Kerja End-to-End</w:t>
@@ -9099,10 +9099,10 @@
           <w:noProof/>
         </w:rPr>
         <w:drawing>
-          <wp:inline distT="0" distB="0" distL="0" distR="0" wp14:anchorId="341B69EC" wp14:editId="1ABB5D40">
+          <wp:inline distT="0" distB="0" distL="0" distR="0" wp14:anchorId="3CAE1317" wp14:editId="7D1F26D4">
             <wp:extent cx="5810250" cy="1752600"/>
             <wp:effectExtent l="0" t="0" r="0" b="0"/>
-            <wp:docPr id="914971389" name="fig2_alur.png" descr="Enam langkah satu kali dikte. Langkah 3–5 berjalan di latar belakang selagi pengguna masih berbicara." title="Enam langkah satu kali dikte. Langkah 3–5 berjalan di latar belakang selagi pengguna masih berbicara."/>
+            <wp:docPr id="1688584351" name="fig2_alur.png" descr="Enam langkah satu kali dikte. Langkah 3–5 berjalan di latar belakang selagi pengguna masih berbicara." title="Enam langkah satu kali dikte. Langkah 3–5 berjalan di latar belakang selagi pengguna masih berbicara."/>
             <wp:cNvGraphicFramePr>
               <a:graphicFrameLocks xmlns:a="http://schemas.openxmlformats.org/drawingml/2006/main" noChangeAspect="1"/>
             </wp:cNvGraphicFramePr>
@@ -9289,7 +9289,7 @@
         <w:pStyle w:val="Heading1"/>
         <w:pageBreakBefore/>
       </w:pPr>
-      <w:bookmarkStart w:id="12" w:name="_Toc242630165"/>
+      <w:bookmarkStart w:id="12" w:name="_Toc242630353"/>
       <w:r>
         <w:lastRenderedPageBreak/>
         <w:t>5. Perekaman Audio</w:t>
@@ -9302,7 +9302,7 @@
         <w:keepNext/>
         <w:keepLines/>
       </w:pPr>
-      <w:bookmarkStart w:id="13" w:name="_Toc242630166"/>
+      <w:bookmarkStart w:id="13" w:name="_Toc242630354"/>
       <w:r>
         <w:t>5.1 Format rekaman</w:t>
       </w:r>
@@ -9331,7 +9331,7 @@
           <w:left w:w="10" w:type="dxa"/>
           <w:right w:w="10" w:type="dxa"/>
         </w:tblCellMar>
-        <w:tblLook w:val="04A0" w:firstRow="1" w:lastRow="0" w:firstColumn="1" w:lastColumn="0" w:noHBand="0" w:noVBand="1"/>
+        <w:tblLook w:val="0000" w:firstRow="0" w:lastRow="0" w:firstColumn="0" w:lastColumn="0" w:noHBand="0" w:noVBand="0"/>
       </w:tblPr>
       <w:tblGrid>
         <w:gridCol w:w="2792"/>
@@ -9782,7 +9782,7 @@
           <w:left w:w="10" w:type="dxa"/>
           <w:right w:w="10" w:type="dxa"/>
         </w:tblCellMar>
-        <w:tblLook w:val="04A0" w:firstRow="1" w:lastRow="0" w:firstColumn="1" w:lastColumn="0" w:noHBand="0" w:noVBand="1"/>
+        <w:tblLook w:val="0000" w:firstRow="0" w:lastRow="0" w:firstColumn="0" w:lastColumn="0" w:noHBand="0" w:noVBand="0"/>
       </w:tblPr>
       <w:tblGrid>
         <w:gridCol w:w="1861"/>
@@ -10306,7 +10306,7 @@
         <w:keepNext/>
         <w:keepLines/>
       </w:pPr>
-      <w:bookmarkStart w:id="14" w:name="_Toc242630167"/>
+      <w:bookmarkStart w:id="14" w:name="_Toc242630355"/>
       <w:r>
         <w:t>5.2 Pipeline audio</w:t>
       </w:r>
@@ -10423,7 +10423,7 @@
         <w:pStyle w:val="Heading1"/>
         <w:pageBreakBefore/>
       </w:pPr>
-      <w:bookmarkStart w:id="15" w:name="_Toc242630168"/>
+      <w:bookmarkStart w:id="15" w:name="_Toc242630356"/>
       <w:r>
         <w:lastRenderedPageBreak/>
         <w:t>6. Segmentasi Otomatis</w:t>
@@ -10459,10 +10459,10 @@
           <w:noProof/>
         </w:rPr>
         <w:drawing>
-          <wp:inline distT="0" distB="0" distL="0" distR="0" wp14:anchorId="20F523EA" wp14:editId="776F7C4E">
+          <wp:inline distT="0" distB="0" distL="0" distR="0" wp14:anchorId="2F218C2D" wp14:editId="350B6940">
             <wp:extent cx="5810250" cy="2905125"/>
             <wp:effectExtent l="0" t="0" r="0" b="0"/>
-            <wp:docPr id="1457348013" name="fig4_gemini.png" descr="Waktu proses Gemini terhadap panjang audio. Rasio detik proses per detik suara melonjak dari 0,12 menjadi 0,47." title="Waktu proses Gemini terhadap panjang audio. Rasio detik proses per detik suara melonjak dari 0,12 menjadi 0,47."/>
+            <wp:docPr id="1052833842" name="fig4_gemini.png" descr="Waktu proses Gemini terhadap panjang audio. Rasio detik proses per detik suara melonjak dari 0,12 menjadi 0,47." title="Waktu proses Gemini terhadap panjang audio. Rasio detik proses per detik suara melonjak dari 0,12 menjadi 0,47."/>
             <wp:cNvGraphicFramePr>
               <a:graphicFrameLocks xmlns:a="http://schemas.openxmlformats.org/drawingml/2006/main" noChangeAspect="1"/>
             </wp:cNvGraphicFramePr>
@@ -10530,7 +10530,7 @@
         <w:keepNext/>
         <w:keepLines/>
       </w:pPr>
-      <w:bookmarkStart w:id="16" w:name="_Toc242630169"/>
+      <w:bookmarkStart w:id="16" w:name="_Toc242630357"/>
       <w:r>
         <w:t>6.1 Aturan pemotongan</w:t>
       </w:r>
@@ -10628,10 +10628,10 @@
           <w:noProof/>
         </w:rPr>
         <w:drawing>
-          <wp:inline distT="0" distB="0" distL="0" distR="0" wp14:anchorId="0B00B44D" wp14:editId="35119A1B">
+          <wp:inline distT="0" distB="0" distL="0" distR="0" wp14:anchorId="11D179FE" wp14:editId="2C41D287">
             <wp:extent cx="5810250" cy="2009775"/>
             <wp:effectExtent l="0" t="0" r="0" b="0"/>
-            <wp:docPr id="496628323" name="fig3_segmen.png" descr="Lini waktu tes nyata 4 menit 58 detik: tujuh segmen diproses selagi pengguna berbicara; setelah selesai hanya segmen terakhir yang ditunggu." title="Lini waktu tes nyata 4 menit 58 detik: tujuh segmen diproses selagi pengguna berbicara; setelah selesai hanya segmen terakhir yang ditunggu."/>
+            <wp:docPr id="873867121" name="fig3_segmen.png" descr="Lini waktu tes nyata 4 menit 58 detik: tujuh segmen diproses selagi pengguna berbicara; setelah selesai hanya segmen terakhir yang ditunggu." title="Lini waktu tes nyata 4 menit 58 detik: tujuh segmen diproses selagi pengguna berbicara; setelah selesai hanya segmen terakhir yang ditunggu."/>
             <wp:cNvGraphicFramePr>
               <a:graphicFrameLocks xmlns:a="http://schemas.openxmlformats.org/drawingml/2006/main" noChangeAspect="1"/>
             </wp:cNvGraphicFramePr>
@@ -10699,7 +10699,7 @@
         <w:keepNext/>
         <w:keepLines/>
       </w:pPr>
-      <w:bookmarkStart w:id="17" w:name="_Toc242630170"/>
+      <w:bookmarkStart w:id="17" w:name="_Toc242630358"/>
       <w:r>
         <w:t>6.2 ChunkPipeline</w:t>
       </w:r>
@@ -10818,10 +10818,10 @@
           <w:noProof/>
         </w:rPr>
         <w:drawing>
-          <wp:inline distT="0" distB="0" distL="0" distR="0" wp14:anchorId="7F51D71F" wp14:editId="01B6ADE3">
+          <wp:inline distT="0" distB="0" distL="0" distR="0" wp14:anchorId="743642EE" wp14:editId="60B2A603">
             <wp:extent cx="4953000" cy="1933575"/>
             <wp:effectExtent l="0" t="0" r="0" b="0"/>
-            <wp:docPr id="1772387044" name="fig5_sebelum_sesudah.png" descr="Waktu tunggu dikte 5 menit sebelum dan sesudah segmentasi." title="Waktu tunggu dikte 5 menit sebelum dan sesudah segmentasi."/>
+            <wp:docPr id="1819681678" name="fig5_sebelum_sesudah.png" descr="Waktu tunggu dikte 5 menit sebelum dan sesudah segmentasi." title="Waktu tunggu dikte 5 menit sebelum dan sesudah segmentasi."/>
             <wp:cNvGraphicFramePr>
               <a:graphicFrameLocks xmlns:a="http://schemas.openxmlformats.org/drawingml/2006/main" noChangeAspect="1"/>
             </wp:cNvGraphicFramePr>
@@ -10888,7 +10888,7 @@
         <w:pStyle w:val="Heading1"/>
         <w:pageBreakBefore/>
       </w:pPr>
-      <w:bookmarkStart w:id="18" w:name="_Toc242630171"/>
+      <w:bookmarkStart w:id="18" w:name="_Toc242630359"/>
       <w:r>
         <w:lastRenderedPageBreak/>
         <w:t>7. Mesin Transkripsi</w:t>
@@ -10910,7 +10910,7 @@
           <w:left w:w="10" w:type="dxa"/>
           <w:right w:w="10" w:type="dxa"/>
         </w:tblCellMar>
-        <w:tblLook w:val="04A0" w:firstRow="1" w:lastRow="0" w:firstColumn="1" w:lastColumn="0" w:noHBand="0" w:noVBand="1"/>
+        <w:tblLook w:val="0000" w:firstRow="0" w:lastRow="0" w:firstColumn="0" w:lastColumn="0" w:noHBand="0" w:noVBand="0"/>
       </w:tblPr>
       <w:tblGrid>
         <w:gridCol w:w="2233"/>
@@ -11720,7 +11720,7 @@
         <w:keepNext/>
         <w:keepLines/>
       </w:pPr>
-      <w:bookmarkStart w:id="19" w:name="_Toc242630172"/>
+      <w:bookmarkStart w:id="19" w:name="_Toc242630360"/>
       <w:r>
         <w:t>7.1 Gemini 3.5 Transcribe</w:t>
       </w:r>
@@ -12025,7 +12025,7 @@
         <w:keepNext/>
         <w:keepLines/>
       </w:pPr>
-      <w:bookmarkStart w:id="20" w:name="_Toc242630173"/>
+      <w:bookmarkStart w:id="20" w:name="_Toc242630361"/>
       <w:r>
         <w:t>7.2 Groq dan endpoint kompatibel OpenAI</w:t>
       </w:r>
@@ -12139,7 +12139,7 @@
         <w:keepNext/>
         <w:keepLines/>
       </w:pPr>
-      <w:bookmarkStart w:id="21" w:name="_Toc242630174"/>
+      <w:bookmarkStart w:id="21" w:name="_Toc242630362"/>
       <w:r>
         <w:t>7.3 whisper.cpp lokal</w:t>
       </w:r>
@@ -12284,7 +12284,7 @@
         <w:keepNext/>
         <w:keepLines/>
       </w:pPr>
-      <w:bookmarkStart w:id="22" w:name="_Toc242630175"/>
+      <w:bookmarkStart w:id="22" w:name="_Toc242630363"/>
       <w:r>
         <w:t>7.4 Apple Speech</w:t>
       </w:r>
@@ -12351,7 +12351,7 @@
         <w:pStyle w:val="Heading1"/>
         <w:pageBreakBefore/>
       </w:pPr>
-      <w:bookmarkStart w:id="23" w:name="_Toc242630176"/>
+      <w:bookmarkStart w:id="23" w:name="_Toc242630364"/>
       <w:r>
         <w:lastRenderedPageBreak/>
         <w:t>8. Rantai Cadangan dan Manajemen Kuota</w:t>
@@ -12387,10 +12387,10 @@
           <w:noProof/>
         </w:rPr>
         <w:drawing>
-          <wp:inline distT="0" distB="0" distL="0" distR="0" wp14:anchorId="5839870D" wp14:editId="31FED04C">
+          <wp:inline distT="0" distB="0" distL="0" distR="0" wp14:anchorId="40979D2D" wp14:editId="1375AA42">
             <wp:extent cx="5810250" cy="2247900"/>
             <wp:effectExtent l="0" t="0" r="0" b="0"/>
-            <wp:docPr id="1631011889" name="fig6_cadangan.png" descr="Rantai cadangan: Gemini sebagai utama, Groq sebagai cadangan, whisper.cpp sebagai pilihan terakhir yang offline." title="Rantai cadangan: Gemini sebagai utama, Groq sebagai cadangan, whisper.cpp sebagai pilihan terakhir yang offline."/>
+            <wp:docPr id="241678388" name="fig6_cadangan.png" descr="Rantai cadangan: Gemini sebagai utama, Groq sebagai cadangan, whisper.cpp sebagai pilihan terakhir yang offline." title="Rantai cadangan: Gemini sebagai utama, Groq sebagai cadangan, whisper.cpp sebagai pilihan terakhir yang offline."/>
             <wp:cNvGraphicFramePr>
               <a:graphicFrameLocks xmlns:a="http://schemas.openxmlformats.org/drawingml/2006/main" noChangeAspect="1"/>
             </wp:cNvGraphicFramePr>
@@ -12458,7 +12458,7 @@
         <w:keepNext/>
         <w:keepLines/>
       </w:pPr>
-      <w:bookmarkStart w:id="24" w:name="_Toc242630177"/>
+      <w:bookmarkStart w:id="24" w:name="_Toc242630365"/>
       <w:r>
         <w:t>8.1 Penyusunan rantai</w:t>
       </w:r>
@@ -12571,7 +12571,7 @@
         <w:keepNext/>
         <w:keepLines/>
       </w:pPr>
-      <w:bookmarkStart w:id="25" w:name="_Toc242630178"/>
+      <w:bookmarkStart w:id="25" w:name="_Toc242630366"/>
       <w:r>
         <w:t>8.2 Skenario kegagalan</w:t>
       </w:r>
@@ -12592,7 +12592,7 @@
           <w:left w:w="10" w:type="dxa"/>
           <w:right w:w="10" w:type="dxa"/>
         </w:tblCellMar>
-        <w:tblLook w:val="04A0" w:firstRow="1" w:lastRow="0" w:firstColumn="1" w:lastColumn="0" w:noHBand="0" w:noVBand="1"/>
+        <w:tblLook w:val="0000" w:firstRow="0" w:lastRow="0" w:firstColumn="0" w:lastColumn="0" w:noHBand="0" w:noVBand="0"/>
       </w:tblPr>
       <w:tblGrid>
         <w:gridCol w:w="2978"/>
@@ -13034,7 +13034,7 @@
         <w:keepNext/>
         <w:keepLines/>
       </w:pPr>
-      <w:bookmarkStart w:id="26" w:name="_Toc242630179"/>
+      <w:bookmarkStart w:id="26" w:name="_Toc242630367"/>
       <w:r>
         <w:t>8.3 Pantauan kuota</w:t>
       </w:r>
@@ -13055,7 +13055,7 @@
           <w:left w:w="10" w:type="dxa"/>
           <w:right w:w="10" w:type="dxa"/>
         </w:tblCellMar>
-        <w:tblLook w:val="04A0" w:firstRow="1" w:lastRow="0" w:firstColumn="1" w:lastColumn="0" w:noHBand="0" w:noVBand="1"/>
+        <w:tblLook w:val="0000" w:firstRow="0" w:lastRow="0" w:firstColumn="0" w:lastColumn="0" w:noHBand="0" w:noVBand="0"/>
       </w:tblPr>
       <w:tblGrid>
         <w:gridCol w:w="1303"/>
@@ -13582,7 +13582,7 @@
         <w:pStyle w:val="Heading1"/>
         <w:pageBreakBefore/>
       </w:pPr>
-      <w:bookmarkStart w:id="27" w:name="_Toc242630180"/>
+      <w:bookmarkStart w:id="27" w:name="_Toc242630368"/>
       <w:r>
         <w:lastRenderedPageBreak/>
         <w:t>9. Perapian Teks</w:t>
@@ -13595,7 +13595,7 @@
         <w:keepNext/>
         <w:keepLines/>
       </w:pPr>
-      <w:bookmarkStart w:id="28" w:name="_Toc242630181"/>
+      <w:bookmarkStart w:id="28" w:name="_Toc242630369"/>
       <w:r>
         <w:t>9.1 Perapian transkrip (selalu aktif)</w:t>
       </w:r>
@@ -13616,7 +13616,7 @@
           <w:left w:w="10" w:type="dxa"/>
           <w:right w:w="10" w:type="dxa"/>
         </w:tblCellMar>
-        <w:tblLook w:val="04A0" w:firstRow="1" w:lastRow="0" w:firstColumn="1" w:lastColumn="0" w:noHBand="0" w:noVBand="1"/>
+        <w:tblLook w:val="0000" w:firstRow="0" w:lastRow="0" w:firstColumn="0" w:lastColumn="0" w:noHBand="0" w:noVBand="0"/>
       </w:tblPr>
       <w:tblGrid>
         <w:gridCol w:w="3909"/>
@@ -14058,7 +14058,7 @@
         <w:keepNext/>
         <w:keepLines/>
       </w:pPr>
-      <w:bookmarkStart w:id="29" w:name="_Toc242630182"/>
+      <w:bookmarkStart w:id="29" w:name="_Toc242630370"/>
       <w:r>
         <w:t>9.2 Parafrase AI (opsional, mati secara bawaan)</w:t>
       </w:r>
@@ -14123,7 +14123,7 @@
         <w:pStyle w:val="Heading1"/>
         <w:pageBreakBefore/>
       </w:pPr>
-      <w:bookmarkStart w:id="30" w:name="_Toc242630183"/>
+      <w:bookmarkStart w:id="30" w:name="_Toc242630371"/>
       <w:r>
         <w:lastRenderedPageBreak/>
         <w:t>10. Penyisipan Teks</w:t>
@@ -14316,7 +14316,7 @@
         <w:pStyle w:val="Heading1"/>
         <w:pageBreakBefore/>
       </w:pPr>
-      <w:bookmarkStart w:id="31" w:name="_Toc242630184"/>
+      <w:bookmarkStart w:id="31" w:name="_Toc242630372"/>
       <w:r>
         <w:lastRenderedPageBreak/>
         <w:t>11. Hotkey dan State Machine</w:t>
@@ -14334,10 +14334,10 @@
           <w:noProof/>
         </w:rPr>
         <w:drawing>
-          <wp:inline distT="0" distB="0" distL="0" distR="0" wp14:anchorId="1789C489" wp14:editId="1B4575D7">
+          <wp:inline distT="0" distB="0" distL="0" distR="0" wp14:anchorId="24115077" wp14:editId="47489855">
             <wp:extent cx="5810250" cy="2390775"/>
             <wp:effectExtent l="0" t="0" r="0" b="0"/>
-            <wp:docPr id="490524100" name="fig7_state.png" descr="State machine DictationController: Idle, Recording, dan Processing." title="State machine DictationController: Idle, Recording, dan Processing."/>
+            <wp:docPr id="858751280" name="fig7_state.png" descr="State machine DictationController: Idle, Recording, dan Processing." title="State machine DictationController: Idle, Recording, dan Processing."/>
             <wp:cNvGraphicFramePr>
               <a:graphicFrameLocks xmlns:a="http://schemas.openxmlformats.org/drawingml/2006/main" noChangeAspect="1"/>
             </wp:cNvGraphicFramePr>
@@ -14405,7 +14405,7 @@
         <w:keepNext/>
         <w:keepLines/>
       </w:pPr>
-      <w:bookmarkStart w:id="32" w:name="_Toc242630185"/>
+      <w:bookmarkStart w:id="32" w:name="_Toc242630373"/>
       <w:r>
         <w:t>11.1 Deteksi tombol</w:t>
       </w:r>
@@ -14426,7 +14426,7 @@
           <w:left w:w="10" w:type="dxa"/>
           <w:right w:w="10" w:type="dxa"/>
         </w:tblCellMar>
-        <w:tblLook w:val="04A0" w:firstRow="1" w:lastRow="0" w:firstColumn="1" w:lastColumn="0" w:noHBand="0" w:noVBand="1"/>
+        <w:tblLook w:val="0000" w:firstRow="0" w:lastRow="0" w:firstColumn="0" w:lastColumn="0" w:noHBand="0" w:noVBand="0"/>
       </w:tblPr>
       <w:tblGrid>
         <w:gridCol w:w="2606"/>
@@ -15137,7 +15137,7 @@
         <w:pStyle w:val="Heading1"/>
         <w:pageBreakBefore/>
       </w:pPr>
-      <w:bookmarkStart w:id="33" w:name="_Toc242630186"/>
+      <w:bookmarkStart w:id="33" w:name="_Toc242630374"/>
       <w:r>
         <w:lastRenderedPageBreak/>
         <w:t>12. Keamanan dan Privasi</w:t>
@@ -15150,7 +15150,7 @@
         <w:keepNext/>
         <w:keepLines/>
       </w:pPr>
-      <w:bookmarkStart w:id="34" w:name="_Toc242630187"/>
+      <w:bookmarkStart w:id="34" w:name="_Toc242630375"/>
       <w:r>
         <w:t>12.1 Izin macOS</w:t>
       </w:r>
@@ -15171,7 +15171,7 @@
           <w:left w:w="10" w:type="dxa"/>
           <w:right w:w="10" w:type="dxa"/>
         </w:tblCellMar>
-        <w:tblLook w:val="04A0" w:firstRow="1" w:lastRow="0" w:firstColumn="1" w:lastColumn="0" w:noHBand="0" w:noVBand="1"/>
+        <w:tblLook w:val="0000" w:firstRow="0" w:lastRow="0" w:firstColumn="0" w:lastColumn="0" w:noHBand="0" w:noVBand="0"/>
       </w:tblPr>
       <w:tblGrid>
         <w:gridCol w:w="2978"/>
@@ -15695,7 +15695,7 @@
         <w:keepNext/>
         <w:keepLines/>
       </w:pPr>
-      <w:bookmarkStart w:id="35" w:name="_Toc242630188"/>
+      <w:bookmarkStart w:id="35" w:name="_Toc242630376"/>
       <w:r>
         <w:t>12.2 Penyimpanan API key</w:t>
       </w:r>
@@ -15730,10 +15730,10 @@
           <w:noProof/>
         </w:rPr>
         <w:drawing>
-          <wp:inline distT="0" distB="0" distL="0" distR="0" wp14:anchorId="52C68A2D" wp14:editId="25AFCEB8">
+          <wp:inline distT="0" distB="0" distL="0" distR="0" wp14:anchorId="4708CA13" wp14:editId="373D0289">
             <wp:extent cx="5810250" cy="2038350"/>
             <wp:effectExtent l="0" t="0" r="0" b="0"/>
-            <wp:docPr id="21487217" name="fig8_keychain.png" descr="Masalah tanda tangan ad-hoc: build baru tidak bisa mengganti item buatan build lama, diselesaikan dengan ACL bersama." title="Masalah tanda tangan ad-hoc: build baru tidak bisa mengganti item buatan build lama, diselesaikan dengan ACL bersama."/>
+            <wp:docPr id="343162146" name="fig8_keychain.png" descr="Masalah tanda tangan ad-hoc: build baru tidak bisa mengganti item buatan build lama, diselesaikan dengan ACL bersama." title="Masalah tanda tangan ad-hoc: build baru tidak bisa mengganti item buatan build lama, diselesaikan dengan ACL bersama."/>
             <wp:cNvGraphicFramePr>
               <a:graphicFrameLocks xmlns:a="http://schemas.openxmlformats.org/drawingml/2006/main" noChangeAspect="1"/>
             </wp:cNvGraphicFramePr>
@@ -15925,7 +15925,7 @@
         <w:keepNext/>
         <w:keepLines/>
       </w:pPr>
-      <w:bookmarkStart w:id="36" w:name="_Toc242630189"/>
+      <w:bookmarkStart w:id="36" w:name="_Toc242630377"/>
       <w:r>
         <w:lastRenderedPageBreak/>
         <w:t>12.3 Data yang disimpan</w:t>
@@ -15947,7 +15947,7 @@
           <w:left w:w="10" w:type="dxa"/>
           <w:right w:w="10" w:type="dxa"/>
         </w:tblCellMar>
-        <w:tblLook w:val="04A0" w:firstRow="1" w:lastRow="0" w:firstColumn="1" w:lastColumn="0" w:noHBand="0" w:noVBand="1"/>
+        <w:tblLook w:val="0000" w:firstRow="0" w:lastRow="0" w:firstColumn="0" w:lastColumn="0" w:noHBand="0" w:noVBand="0"/>
       </w:tblPr>
       <w:tblGrid>
         <w:gridCol w:w="1861"/>
@@ -16568,7 +16568,7 @@
         <w:pStyle w:val="Heading1"/>
         <w:pageBreakBefore/>
       </w:pPr>
-      <w:bookmarkStart w:id="37" w:name="_Toc242630190"/>
+      <w:bookmarkStart w:id="37" w:name="_Toc242630378"/>
       <w:r>
         <w:lastRenderedPageBreak/>
         <w:t>13. Keputusan Rekayasa</w:t>
@@ -16598,7 +16598,7 @@
           <w:left w:w="10" w:type="dxa"/>
           <w:right w:w="10" w:type="dxa"/>
         </w:tblCellMar>
-        <w:tblLook w:val="04A0" w:firstRow="1" w:lastRow="0" w:firstColumn="1" w:lastColumn="0" w:noHBand="0" w:noVBand="1"/>
+        <w:tblLook w:val="0000" w:firstRow="0" w:lastRow="0" w:firstColumn="0" w:lastColumn="0" w:noHBand="0" w:noVBand="0"/>
       </w:tblPr>
       <w:tblGrid>
         <w:gridCol w:w="2420"/>
@@ -17816,7 +17816,7 @@
         <w:pStyle w:val="Heading1"/>
         <w:pageBreakBefore/>
       </w:pPr>
-      <w:bookmarkStart w:id="38" w:name="_Toc242630191"/>
+      <w:bookmarkStart w:id="38" w:name="_Toc242630379"/>
       <w:r>
         <w:lastRenderedPageBreak/>
         <w:t>14. Pengujian dan Benchmark</w:t>
@@ -17846,7 +17846,7 @@
           <w:left w:w="10" w:type="dxa"/>
           <w:right w:w="10" w:type="dxa"/>
         </w:tblCellMar>
-        <w:tblLook w:val="04A0" w:firstRow="1" w:lastRow="0" w:firstColumn="1" w:lastColumn="0" w:noHBand="0" w:noVBand="1"/>
+        <w:tblLook w:val="0000" w:firstRow="0" w:lastRow="0" w:firstColumn="0" w:lastColumn="0" w:noHBand="0" w:noVBand="0"/>
       </w:tblPr>
       <w:tblGrid>
         <w:gridCol w:w="3722"/>
@@ -18639,7 +18639,7 @@
         <w:keepNext/>
         <w:keepLines/>
       </w:pPr>
-      <w:bookmarkStart w:id="39" w:name="_Toc242630192"/>
+      <w:bookmarkStart w:id="39" w:name="_Toc242630380"/>
       <w:r>
         <w:t>14.1 Alat uji</w:t>
       </w:r>
@@ -18823,7 +18823,7 @@
         <w:pStyle w:val="Heading1"/>
         <w:pageBreakBefore/>
       </w:pPr>
-      <w:bookmarkStart w:id="40" w:name="_Toc242630193"/>
+      <w:bookmarkStart w:id="40" w:name="_Toc242630381"/>
       <w:r>
         <w:lastRenderedPageBreak/>
         <w:t>15. Build, Rilis, dan Distribusi</w:t>
@@ -18845,7 +18845,7 @@
           <w:left w:w="10" w:type="dxa"/>
           <w:right w:w="10" w:type="dxa"/>
         </w:tblCellMar>
-        <w:tblLook w:val="04A0" w:firstRow="1" w:lastRow="0" w:firstColumn="1" w:lastColumn="0" w:noHBand="0" w:noVBand="1"/>
+        <w:tblLook w:val="0000" w:firstRow="0" w:lastRow="0" w:firstColumn="0" w:lastColumn="0" w:noHBand="0" w:noVBand="0"/>
       </w:tblPr>
       <w:tblGrid>
         <w:gridCol w:w="2420"/>
@@ -19298,7 +19298,7 @@
         <w:keepNext/>
         <w:keepLines/>
       </w:pPr>
-      <w:bookmarkStart w:id="41" w:name="_Toc242630194"/>
+      <w:bookmarkStart w:id="41" w:name="_Toc242630382"/>
       <w:r>
         <w:t>15.1 Distribusi</w:t>
       </w:r>
@@ -19323,10 +19323,22 @@
           <w:sz w:val="18"/>
           <w:szCs w:val="18"/>
         </w:rPr>
-        <w:t>yaping-v1.0</w:t>
-      </w:r>
-      <w:r>
-        <w:t xml:space="preserve"> (repositori berisi beberapa proyek, sehingga tidak memakai tautan “latest”).</w:t>
+        <w:t>yaping-v&lt;versi&gt;</w:t>
+      </w:r>
+      <w:r>
+        <w:t xml:space="preserve"> (saat ini </w:t>
+      </w:r>
+      <w:r>
+        <w:rPr>
+          <w:rFonts w:ascii="Menlo" w:eastAsia="Menlo" w:hAnsi="Menlo" w:cs="Menlo"/>
+          <w:color w:val="B4235A"/>
+          <w:sz w:val="18"/>
+          <w:szCs w:val="18"/>
+        </w:rPr>
+        <w:t>yaping-v1.0.1</w:t>
+      </w:r>
+      <w:r>
+        <w:t>), karena repositori berisi beberapa proyek sehingga tidak memakai tautan “latest”.</w:t>
       </w:r>
     </w:p>
     <w:p>
@@ -19339,17 +19351,14 @@
         <w:spacing w:after="60" w:line="290" w:lineRule="auto"/>
       </w:pPr>
       <w:r>
-        <w:t xml:space="preserve">Aplikasi tidak dinotarisasi; pengguna membuka sekali lewat </w:t>
-      </w:r>
-      <w:r>
         <w:rPr>
           <w:b/>
           <w:bCs/>
         </w:rPr>
-        <w:t>Open Anyway</w:t>
-      </w:r>
-      <w:r>
-        <w:t xml:space="preserve"> di Privacy &amp; Security.</w:t>
+        <w:t>v1.0.1</w:t>
+      </w:r>
+      <w:r>
+        <w:t xml:space="preserve"> memperbaiki penyimpanan API key (Bab 12.2) dan menambahkan kontrol Simpan / Ubah / Hapus.</w:t>
       </w:r>
     </w:p>
     <w:p>
@@ -19362,6 +19371,29 @@
         <w:spacing w:after="60" w:line="290" w:lineRule="auto"/>
       </w:pPr>
       <w:r>
+        <w:t xml:space="preserve">Aplikasi tidak dinotarisasi; pengguna membuka sekali lewat </w:t>
+      </w:r>
+      <w:r>
+        <w:rPr>
+          <w:b/>
+          <w:bCs/>
+        </w:rPr>
+        <w:t>Open Anyway</w:t>
+      </w:r>
+      <w:r>
+        <w:t xml:space="preserve"> di Privacy &amp; Security.</w:t>
+      </w:r>
+    </w:p>
+    <w:p>
+      <w:pPr>
+        <w:pStyle w:val="ListParagraph"/>
+        <w:numPr>
+          <w:ilvl w:val="0"/>
+          <w:numId w:val="2"/>
+        </w:numPr>
+        <w:spacing w:after="60" w:line="290" w:lineRule="auto"/>
+      </w:pPr>
+      <w:r>
         <w:t>Hanya untuk Apple Silicon (arm64), macOS 14+.</w:t>
       </w:r>
     </w:p>
@@ -19370,7 +19402,7 @@
         <w:pStyle w:val="Heading1"/>
         <w:pageBreakBefore/>
       </w:pPr>
-      <w:bookmarkStart w:id="42" w:name="_Toc242630195"/>
+      <w:bookmarkStart w:id="42" w:name="_Toc242630383"/>
       <w:r>
         <w:lastRenderedPageBreak/>
         <w:t>16. Keterbatasan dan Rencana Pengembangan</w:t>
@@ -19383,7 +19415,7 @@
         <w:keepNext/>
         <w:keepLines/>
       </w:pPr>
-      <w:bookmarkStart w:id="43" w:name="_Toc242630196"/>
+      <w:bookmarkStart w:id="43" w:name="_Toc242630384"/>
       <w:r>
         <w:t>16.1 Keterbatasan saat ini</w:t>
       </w:r>
@@ -19447,7 +19479,7 @@
         <w:keepNext/>
         <w:keepLines/>
       </w:pPr>
-      <w:bookmarkStart w:id="44" w:name="_Toc242630197"/>
+      <w:bookmarkStart w:id="44" w:name="_Toc242630385"/>
       <w:r>
         <w:t>16.2 Rencana</w:t>
       </w:r>
@@ -19468,7 +19500,7 @@
           <w:left w:w="10" w:type="dxa"/>
           <w:right w:w="10" w:type="dxa"/>
         </w:tblCellMar>
-        <w:tblLook w:val="04A0" w:firstRow="1" w:lastRow="0" w:firstColumn="1" w:lastColumn="0" w:noHBand="0" w:noVBand="1"/>
+        <w:tblLook w:val="0000" w:firstRow="0" w:lastRow="0" w:firstColumn="0" w:lastColumn="0" w:noHBand="0" w:noVBand="0"/>
       </w:tblPr>
       <w:tblGrid>
         <w:gridCol w:w="2792"/>
@@ -20089,7 +20121,7 @@
         <w:pStyle w:val="Heading1"/>
         <w:pageBreakBefore/>
       </w:pPr>
-      <w:bookmarkStart w:id="45" w:name="_Toc242630198"/>
+      <w:bookmarkStart w:id="45" w:name="_Toc242630386"/>
       <w:r>
         <w:lastRenderedPageBreak/>
         <w:t>Lampiran A. Kunci Pengaturan (UserDefaults)</w:t>
@@ -20111,7 +20143,7 @@
           <w:left w:w="10" w:type="dxa"/>
           <w:right w:w="10" w:type="dxa"/>
         </w:tblCellMar>
-        <w:tblLook w:val="04A0" w:firstRow="1" w:lastRow="0" w:firstColumn="1" w:lastColumn="0" w:noHBand="0" w:noVBand="1"/>
+        <w:tblLook w:val="0000" w:firstRow="0" w:lastRow="0" w:firstColumn="0" w:lastColumn="0" w:noHBand="0" w:noVBand="0"/>
       </w:tblPr>
       <w:tblGrid>
         <w:gridCol w:w="4467"/>
@@ -20904,7 +20936,7 @@
         <w:keepNext/>
         <w:keepLines/>
       </w:pPr>
-      <w:bookmarkStart w:id="46" w:name="_Toc242630199"/>
+      <w:bookmarkStart w:id="46" w:name="_Toc242630387"/>
       <w:r>
         <w:t>Lampiran B. Struktur Repositori</w:t>
       </w:r>
@@ -21263,172 +21295,10 @@
 <file path=word/numbering.xml><?xml version="1.0" encoding="utf-8"?>
 <w:numbering xmlns:wpc="http://schemas.microsoft.com/office/word/2010/wordprocessingCanvas" xmlns:cx="http://schemas.microsoft.com/office/drawing/2014/chartex" xmlns:cx1="http://schemas.microsoft.com/office/drawing/2015/9/8/chartex" xmlns:cx2="http://schemas.microsoft.com/office/drawing/2015/10/21/chartex" xmlns:cx3="http://schemas.microsoft.com/office/drawing/2016/5/9/chartex" xmlns:cx4="http://schemas.microsoft.com/office/drawing/2016/5/10/chartex" xmlns:cx5="http://schemas.microsoft.com/office/drawing/2016/5/11/chartex" xmlns:cx6="http://schemas.microsoft.com/office/drawing/2016/5/12/chartex" xmlns:cx7="http://schemas.microsoft.com/office/drawing/2016/5/13/chartex" xmlns:cx8="http://schemas.microsoft.com/office/drawing/2016/5/14/chartex" xmlns:mc="http://schemas.openxmlformats.org/markup-compatibility/2006" xmlns:m="http://schemas.openxmlformats.org/officeDocument/2006/math" xmlns:aink="http://schemas.microsoft.com/office/drawing/2016/ink" xmlns:am3d="http://schemas.microsoft.com/office/drawing/2017/model3d" xmlns:oel="http://schemas.microsoft.com/office/2019/extlst" xmlns:r="http://schemas.openxmlformats.org/officeDocument/2006/relationships" xmlns:wp14="http://schemas.microsoft.com/office/word/2010/wordprocessingDrawing" xmlns:wp="http://schemas.openxmlformats.org/drawingml/2006/wordprocessingDrawing" xmlns:wpg="http://schemas.microsoft.com/office/word/2010/wordprocessingGroup" xmlns:wpi="http://schemas.microsoft.com/office/word/2010/wordprocessingInk" xmlns:wps="http://schemas.microsoft.com/office/word/2010/wordprocessingShape" xmlns:o="urn:schemas-microsoft-com:office:office" xmlns:v="urn:schemas-microsoft-com:vml" xmlns:w10="urn:schemas-microsoft-com:office:word" xmlns:w="http://schemas.openxmlformats.org/wordprocessingml/2006/main" xmlns:w14="http://schemas.microsoft.com/office/word/2010/wordml" xmlns:w15="http://schemas.microsoft.com/office/word/2012/wordml" xmlns:w16cex="http://schemas.microsoft.com/office/word/2018/wordml/cex" xmlns:w16cid="http://schemas.microsoft.com/office/word/2016/wordml/cid" xmlns:w16="http://schemas.microsoft.com/office/word/2018/wordml" xmlns:w16sdtdh="http://schemas.microsoft.com/office/word/2020/wordml/sdtdatahash" xmlns:w16sdtfl="http://schemas.microsoft.com/office/word/2024/wordml/sdtformatlock" xmlns:w16se="http://schemas.microsoft.com/office/word/2015/wordml/symex" xmlns:w16du="http://schemas.microsoft.com/office/word/2023/wordml/word16du" xmlns:wne="http://schemas.microsoft.com/office/word/2006/wordml" mc:Ignorable="w14 w15 w16se w16cid w16 w16cex w16sdtdh w16sdtfl w16du wp14">
   <w:abstractNum w:abstractNumId="0" w15:restartNumberingAfterBreak="0">
-    <w:nsid w:val="01455663"/>
+    <w:nsid w:val="07493C08"/>
     <w:multiLevelType w:val="hybridMultilevel"/>
-    <w:tmpl w:val="D2943716"/>
-    <w:lvl w:ilvl="0" w:tplc="D70CA074">
-      <w:start w:val="1"/>
-      <w:numFmt w:val="decimal"/>
-      <w:lvlText w:val="%1."/>
-      <w:lvlJc w:val="left"/>
-      <w:pPr>
-        <w:ind w:left="540" w:hanging="320"/>
-      </w:pPr>
-    </w:lvl>
-    <w:lvl w:ilvl="1" w:tplc="EC7CCE10">
-      <w:numFmt w:val="decimal"/>
-      <w:lvlText w:val=""/>
-      <w:lvlJc w:val="left"/>
-    </w:lvl>
-    <w:lvl w:ilvl="2" w:tplc="C1741BF8">
-      <w:numFmt w:val="decimal"/>
-      <w:lvlText w:val=""/>
-      <w:lvlJc w:val="left"/>
-    </w:lvl>
-    <w:lvl w:ilvl="3" w:tplc="513A9622">
-      <w:numFmt w:val="decimal"/>
-      <w:lvlText w:val=""/>
-      <w:lvlJc w:val="left"/>
-    </w:lvl>
-    <w:lvl w:ilvl="4" w:tplc="14D454B2">
-      <w:numFmt w:val="decimal"/>
-      <w:lvlText w:val=""/>
-      <w:lvlJc w:val="left"/>
-    </w:lvl>
-    <w:lvl w:ilvl="5" w:tplc="8DA45BFE">
-      <w:numFmt w:val="decimal"/>
-      <w:lvlText w:val=""/>
-      <w:lvlJc w:val="left"/>
-    </w:lvl>
-    <w:lvl w:ilvl="6" w:tplc="92D20730">
-      <w:numFmt w:val="decimal"/>
-      <w:lvlText w:val=""/>
-      <w:lvlJc w:val="left"/>
-    </w:lvl>
-    <w:lvl w:ilvl="7" w:tplc="103C3824">
-      <w:numFmt w:val="decimal"/>
-      <w:lvlText w:val=""/>
-      <w:lvlJc w:val="left"/>
-    </w:lvl>
-    <w:lvl w:ilvl="8" w:tplc="4DA89382">
-      <w:numFmt w:val="decimal"/>
-      <w:lvlText w:val=""/>
-      <w:lvlJc w:val="left"/>
-    </w:lvl>
-  </w:abstractNum>
-  <w:abstractNum w:abstractNumId="1" w15:restartNumberingAfterBreak="0">
-    <w:nsid w:val="15B044FD"/>
-    <w:multiLevelType w:val="hybridMultilevel"/>
-    <w:tmpl w:val="E2F208E4"/>
-    <w:lvl w:ilvl="0" w:tplc="533EE07A">
-      <w:start w:val="1"/>
-      <w:numFmt w:val="decimal"/>
-      <w:lvlText w:val="%1."/>
-      <w:lvlJc w:val="left"/>
-      <w:pPr>
-        <w:ind w:left="540" w:hanging="320"/>
-      </w:pPr>
-    </w:lvl>
-    <w:lvl w:ilvl="1" w:tplc="66369E18">
-      <w:numFmt w:val="decimal"/>
-      <w:lvlText w:val=""/>
-      <w:lvlJc w:val="left"/>
-    </w:lvl>
-    <w:lvl w:ilvl="2" w:tplc="88DA7C68">
-      <w:numFmt w:val="decimal"/>
-      <w:lvlText w:val=""/>
-      <w:lvlJc w:val="left"/>
-    </w:lvl>
-    <w:lvl w:ilvl="3" w:tplc="3A44AD9A">
-      <w:numFmt w:val="decimal"/>
-      <w:lvlText w:val=""/>
-      <w:lvlJc w:val="left"/>
-    </w:lvl>
-    <w:lvl w:ilvl="4" w:tplc="89ECCD9C">
-      <w:numFmt w:val="decimal"/>
-      <w:lvlText w:val=""/>
-      <w:lvlJc w:val="left"/>
-    </w:lvl>
-    <w:lvl w:ilvl="5" w:tplc="6C2EBD00">
-      <w:numFmt w:val="decimal"/>
-      <w:lvlText w:val=""/>
-      <w:lvlJc w:val="left"/>
-    </w:lvl>
-    <w:lvl w:ilvl="6" w:tplc="34C0130C">
-      <w:numFmt w:val="decimal"/>
-      <w:lvlText w:val=""/>
-      <w:lvlJc w:val="left"/>
-    </w:lvl>
-    <w:lvl w:ilvl="7" w:tplc="362247CC">
-      <w:numFmt w:val="decimal"/>
-      <w:lvlText w:val=""/>
-      <w:lvlJc w:val="left"/>
-    </w:lvl>
-    <w:lvl w:ilvl="8" w:tplc="E112F432">
-      <w:numFmt w:val="decimal"/>
-      <w:lvlText w:val=""/>
-      <w:lvlJc w:val="left"/>
-    </w:lvl>
-  </w:abstractNum>
-  <w:abstractNum w:abstractNumId="2" w15:restartNumberingAfterBreak="0">
-    <w:nsid w:val="54423FB7"/>
-    <w:multiLevelType w:val="hybridMultilevel"/>
-    <w:tmpl w:val="2624AA70"/>
-    <w:lvl w:ilvl="0" w:tplc="0EB0D222">
-      <w:start w:val="1"/>
-      <w:numFmt w:val="decimal"/>
-      <w:lvlText w:val="%1."/>
-      <w:lvlJc w:val="left"/>
-      <w:pPr>
-        <w:ind w:left="540" w:hanging="320"/>
-      </w:pPr>
-    </w:lvl>
-    <w:lvl w:ilvl="1" w:tplc="DA28F138">
-      <w:numFmt w:val="decimal"/>
-      <w:lvlText w:val=""/>
-      <w:lvlJc w:val="left"/>
-    </w:lvl>
-    <w:lvl w:ilvl="2" w:tplc="A4140326">
-      <w:numFmt w:val="decimal"/>
-      <w:lvlText w:val=""/>
-      <w:lvlJc w:val="left"/>
-    </w:lvl>
-    <w:lvl w:ilvl="3" w:tplc="4C64EDC2">
-      <w:numFmt w:val="decimal"/>
-      <w:lvlText w:val=""/>
-      <w:lvlJc w:val="left"/>
-    </w:lvl>
-    <w:lvl w:ilvl="4" w:tplc="B6D81258">
-      <w:numFmt w:val="decimal"/>
-      <w:lvlText w:val=""/>
-      <w:lvlJc w:val="left"/>
-    </w:lvl>
-    <w:lvl w:ilvl="5" w:tplc="20A49362">
-      <w:numFmt w:val="decimal"/>
-      <w:lvlText w:val=""/>
-      <w:lvlJc w:val="left"/>
-    </w:lvl>
-    <w:lvl w:ilvl="6" w:tplc="8910922A">
-      <w:numFmt w:val="decimal"/>
-      <w:lvlText w:val=""/>
-      <w:lvlJc w:val="left"/>
-    </w:lvl>
-    <w:lvl w:ilvl="7" w:tplc="CBCE1FC8">
-      <w:numFmt w:val="decimal"/>
-      <w:lvlText w:val=""/>
-      <w:lvlJc w:val="left"/>
-    </w:lvl>
-    <w:lvl w:ilvl="8" w:tplc="887C9DB4">
-      <w:numFmt w:val="decimal"/>
-      <w:lvlText w:val=""/>
-      <w:lvlJc w:val="left"/>
-    </w:lvl>
-  </w:abstractNum>
-  <w:abstractNum w:abstractNumId="3" w15:restartNumberingAfterBreak="0">
-    <w:nsid w:val="6A580227"/>
-    <w:multiLevelType w:val="hybridMultilevel"/>
-    <w:tmpl w:val="8E70C142"/>
-    <w:lvl w:ilvl="0" w:tplc="B4B4FDD6">
+    <w:tmpl w:val="968609F2"/>
+    <w:lvl w:ilvl="0" w:tplc="0C6C0222">
       <w:start w:val="1"/>
       <w:numFmt w:val="bullet"/>
       <w:lvlText w:val="•"/>
@@ -21437,7 +21307,7 @@
         <w:ind w:left="540" w:hanging="270"/>
       </w:pPr>
     </w:lvl>
-    <w:lvl w:ilvl="1" w:tplc="BE10E9DA">
+    <w:lvl w:ilvl="1" w:tplc="118EBE16">
       <w:start w:val="1"/>
       <w:numFmt w:val="bullet"/>
       <w:lvlText w:val="–"/>
@@ -21446,47 +21316,47 @@
         <w:ind w:left="1000" w:hanging="270"/>
       </w:pPr>
     </w:lvl>
-    <w:lvl w:ilvl="2" w:tplc="E85A4312">
+    <w:lvl w:ilvl="2" w:tplc="E946E48C">
       <w:numFmt w:val="decimal"/>
       <w:lvlText w:val=""/>
       <w:lvlJc w:val="left"/>
     </w:lvl>
-    <w:lvl w:ilvl="3" w:tplc="9776F60A">
+    <w:lvl w:ilvl="3" w:tplc="8AD4485C">
       <w:numFmt w:val="decimal"/>
       <w:lvlText w:val=""/>
       <w:lvlJc w:val="left"/>
     </w:lvl>
-    <w:lvl w:ilvl="4" w:tplc="7254963A">
+    <w:lvl w:ilvl="4" w:tplc="4ADC447C">
       <w:numFmt w:val="decimal"/>
       <w:lvlText w:val=""/>
       <w:lvlJc w:val="left"/>
     </w:lvl>
-    <w:lvl w:ilvl="5" w:tplc="940C05F4">
+    <w:lvl w:ilvl="5" w:tplc="AF8AE7AA">
       <w:numFmt w:val="decimal"/>
       <w:lvlText w:val=""/>
       <w:lvlJc w:val="left"/>
     </w:lvl>
-    <w:lvl w:ilvl="6" w:tplc="D7FEE7E4">
+    <w:lvl w:ilvl="6" w:tplc="2C22612E">
       <w:numFmt w:val="decimal"/>
       <w:lvlText w:val=""/>
       <w:lvlJc w:val="left"/>
     </w:lvl>
-    <w:lvl w:ilvl="7" w:tplc="B582F028">
+    <w:lvl w:ilvl="7" w:tplc="855A5D66">
       <w:numFmt w:val="decimal"/>
       <w:lvlText w:val=""/>
       <w:lvlJc w:val="left"/>
     </w:lvl>
-    <w:lvl w:ilvl="8" w:tplc="D278EFA4">
+    <w:lvl w:ilvl="8" w:tplc="8CDA0098">
       <w:numFmt w:val="decimal"/>
       <w:lvlText w:val=""/>
       <w:lvlJc w:val="left"/>
     </w:lvl>
   </w:abstractNum>
-  <w:abstractNum w:abstractNumId="4" w15:restartNumberingAfterBreak="0">
-    <w:nsid w:val="79DC36E0"/>
+  <w:abstractNum w:abstractNumId="1" w15:restartNumberingAfterBreak="0">
+    <w:nsid w:val="0D4A0074"/>
     <w:multiLevelType w:val="hybridMultilevel"/>
-    <w:tmpl w:val="F58C8B38"/>
-    <w:lvl w:ilvl="0" w:tplc="82A459FA">
+    <w:tmpl w:val="17C8BEF0"/>
+    <w:lvl w:ilvl="0" w:tplc="9C784C48">
       <w:start w:val="1"/>
       <w:numFmt w:val="bullet"/>
       <w:lvlText w:val="●"/>
@@ -21495,7 +21365,7 @@
         <w:ind w:left="720" w:hanging="360"/>
       </w:pPr>
     </w:lvl>
-    <w:lvl w:ilvl="1" w:tplc="3360358A">
+    <w:lvl w:ilvl="1" w:tplc="E8083300">
       <w:start w:val="1"/>
       <w:numFmt w:val="bullet"/>
       <w:lvlText w:val="○"/>
@@ -21504,7 +21374,7 @@
         <w:ind w:left="1440" w:hanging="360"/>
       </w:pPr>
     </w:lvl>
-    <w:lvl w:ilvl="2" w:tplc="64B4E836">
+    <w:lvl w:ilvl="2" w:tplc="142C50DE">
       <w:start w:val="1"/>
       <w:numFmt w:val="bullet"/>
       <w:lvlText w:val="■"/>
@@ -21513,7 +21383,7 @@
         <w:ind w:left="2160" w:hanging="360"/>
       </w:pPr>
     </w:lvl>
-    <w:lvl w:ilvl="3" w:tplc="FE22FC94">
+    <w:lvl w:ilvl="3" w:tplc="AFC8FF9E">
       <w:start w:val="1"/>
       <w:numFmt w:val="bullet"/>
       <w:lvlText w:val="●"/>
@@ -21522,7 +21392,7 @@
         <w:ind w:left="2880" w:hanging="360"/>
       </w:pPr>
     </w:lvl>
-    <w:lvl w:ilvl="4" w:tplc="43BE4BFE">
+    <w:lvl w:ilvl="4" w:tplc="E6A635B4">
       <w:start w:val="1"/>
       <w:numFmt w:val="bullet"/>
       <w:lvlText w:val="○"/>
@@ -21531,7 +21401,7 @@
         <w:ind w:left="3600" w:hanging="360"/>
       </w:pPr>
     </w:lvl>
-    <w:lvl w:ilvl="5" w:tplc="AC2A69D8">
+    <w:lvl w:ilvl="5" w:tplc="98660FBA">
       <w:start w:val="1"/>
       <w:numFmt w:val="bullet"/>
       <w:lvlText w:val="■"/>
@@ -21540,7 +21410,7 @@
         <w:ind w:left="4320" w:hanging="360"/>
       </w:pPr>
     </w:lvl>
-    <w:lvl w:ilvl="6" w:tplc="DE70207E">
+    <w:lvl w:ilvl="6" w:tplc="9ACC17E4">
       <w:start w:val="1"/>
       <w:numFmt w:val="bullet"/>
       <w:lvlText w:val="●"/>
@@ -21549,7 +21419,7 @@
         <w:ind w:left="5040" w:hanging="360"/>
       </w:pPr>
     </w:lvl>
-    <w:lvl w:ilvl="7" w:tplc="DCF06F2C">
+    <w:lvl w:ilvl="7" w:tplc="04860746">
       <w:start w:val="1"/>
       <w:numFmt w:val="bullet"/>
       <w:lvlText w:val="●"/>
@@ -21558,7 +21428,7 @@
         <w:ind w:left="5760" w:hanging="360"/>
       </w:pPr>
     </w:lvl>
-    <w:lvl w:ilvl="8" w:tplc="5F26C8E4">
+    <w:lvl w:ilvl="8" w:tplc="6776B432">
       <w:start w:val="1"/>
       <w:numFmt w:val="bullet"/>
       <w:lvlText w:val="●"/>
@@ -21568,32 +21438,194 @@
       </w:pPr>
     </w:lvl>
   </w:abstractNum>
-  <w:num w:numId="1" w16cid:durableId="949051911">
+  <w:abstractNum w:abstractNumId="2" w15:restartNumberingAfterBreak="0">
+    <w:nsid w:val="365C298F"/>
+    <w:multiLevelType w:val="hybridMultilevel"/>
+    <w:tmpl w:val="2FDC90FA"/>
+    <w:lvl w:ilvl="0" w:tplc="34F63BD4">
+      <w:start w:val="1"/>
+      <w:numFmt w:val="decimal"/>
+      <w:lvlText w:val="%1."/>
+      <w:lvlJc w:val="left"/>
+      <w:pPr>
+        <w:ind w:left="540" w:hanging="320"/>
+      </w:pPr>
+    </w:lvl>
+    <w:lvl w:ilvl="1" w:tplc="B7A4BA6C">
+      <w:numFmt w:val="decimal"/>
+      <w:lvlText w:val=""/>
+      <w:lvlJc w:val="left"/>
+    </w:lvl>
+    <w:lvl w:ilvl="2" w:tplc="5086A7F6">
+      <w:numFmt w:val="decimal"/>
+      <w:lvlText w:val=""/>
+      <w:lvlJc w:val="left"/>
+    </w:lvl>
+    <w:lvl w:ilvl="3" w:tplc="04989BB6">
+      <w:numFmt w:val="decimal"/>
+      <w:lvlText w:val=""/>
+      <w:lvlJc w:val="left"/>
+    </w:lvl>
+    <w:lvl w:ilvl="4" w:tplc="0E5E73A4">
+      <w:numFmt w:val="decimal"/>
+      <w:lvlText w:val=""/>
+      <w:lvlJc w:val="left"/>
+    </w:lvl>
+    <w:lvl w:ilvl="5" w:tplc="D450BF64">
+      <w:numFmt w:val="decimal"/>
+      <w:lvlText w:val=""/>
+      <w:lvlJc w:val="left"/>
+    </w:lvl>
+    <w:lvl w:ilvl="6" w:tplc="E0C0BAD4">
+      <w:numFmt w:val="decimal"/>
+      <w:lvlText w:val=""/>
+      <w:lvlJc w:val="left"/>
+    </w:lvl>
+    <w:lvl w:ilvl="7" w:tplc="EF5670F2">
+      <w:numFmt w:val="decimal"/>
+      <w:lvlText w:val=""/>
+      <w:lvlJc w:val="left"/>
+    </w:lvl>
+    <w:lvl w:ilvl="8" w:tplc="83861418">
+      <w:numFmt w:val="decimal"/>
+      <w:lvlText w:val=""/>
+      <w:lvlJc w:val="left"/>
+    </w:lvl>
+  </w:abstractNum>
+  <w:abstractNum w:abstractNumId="3" w15:restartNumberingAfterBreak="0">
+    <w:nsid w:val="396055CC"/>
+    <w:multiLevelType w:val="hybridMultilevel"/>
+    <w:tmpl w:val="85DA9A62"/>
+    <w:lvl w:ilvl="0" w:tplc="13481DE0">
+      <w:start w:val="1"/>
+      <w:numFmt w:val="decimal"/>
+      <w:lvlText w:val="%1."/>
+      <w:lvlJc w:val="left"/>
+      <w:pPr>
+        <w:ind w:left="540" w:hanging="320"/>
+      </w:pPr>
+    </w:lvl>
+    <w:lvl w:ilvl="1" w:tplc="98E2A666">
+      <w:numFmt w:val="decimal"/>
+      <w:lvlText w:val=""/>
+      <w:lvlJc w:val="left"/>
+    </w:lvl>
+    <w:lvl w:ilvl="2" w:tplc="0B3C7DBA">
+      <w:numFmt w:val="decimal"/>
+      <w:lvlText w:val=""/>
+      <w:lvlJc w:val="left"/>
+    </w:lvl>
+    <w:lvl w:ilvl="3" w:tplc="B220F838">
+      <w:numFmt w:val="decimal"/>
+      <w:lvlText w:val=""/>
+      <w:lvlJc w:val="left"/>
+    </w:lvl>
+    <w:lvl w:ilvl="4" w:tplc="37B2F27C">
+      <w:numFmt w:val="decimal"/>
+      <w:lvlText w:val=""/>
+      <w:lvlJc w:val="left"/>
+    </w:lvl>
+    <w:lvl w:ilvl="5" w:tplc="2DA80DA2">
+      <w:numFmt w:val="decimal"/>
+      <w:lvlText w:val=""/>
+      <w:lvlJc w:val="left"/>
+    </w:lvl>
+    <w:lvl w:ilvl="6" w:tplc="56B0FDB6">
+      <w:numFmt w:val="decimal"/>
+      <w:lvlText w:val=""/>
+      <w:lvlJc w:val="left"/>
+    </w:lvl>
+    <w:lvl w:ilvl="7" w:tplc="E2429AF2">
+      <w:numFmt w:val="decimal"/>
+      <w:lvlText w:val=""/>
+      <w:lvlJc w:val="left"/>
+    </w:lvl>
+    <w:lvl w:ilvl="8" w:tplc="D5026F84">
+      <w:numFmt w:val="decimal"/>
+      <w:lvlText w:val=""/>
+      <w:lvlJc w:val="left"/>
+    </w:lvl>
+  </w:abstractNum>
+  <w:abstractNum w:abstractNumId="4" w15:restartNumberingAfterBreak="0">
+    <w:nsid w:val="541731E9"/>
+    <w:multiLevelType w:val="hybridMultilevel"/>
+    <w:tmpl w:val="0AFCD0FE"/>
+    <w:lvl w:ilvl="0" w:tplc="2870C3D4">
+      <w:start w:val="1"/>
+      <w:numFmt w:val="decimal"/>
+      <w:lvlText w:val="%1."/>
+      <w:lvlJc w:val="left"/>
+      <w:pPr>
+        <w:ind w:left="540" w:hanging="320"/>
+      </w:pPr>
+    </w:lvl>
+    <w:lvl w:ilvl="1" w:tplc="4F8ABAE6">
+      <w:numFmt w:val="decimal"/>
+      <w:lvlText w:val=""/>
+      <w:lvlJc w:val="left"/>
+    </w:lvl>
+    <w:lvl w:ilvl="2" w:tplc="C0AAC964">
+      <w:numFmt w:val="decimal"/>
+      <w:lvlText w:val=""/>
+      <w:lvlJc w:val="left"/>
+    </w:lvl>
+    <w:lvl w:ilvl="3" w:tplc="833AE7C2">
+      <w:numFmt w:val="decimal"/>
+      <w:lvlText w:val=""/>
+      <w:lvlJc w:val="left"/>
+    </w:lvl>
+    <w:lvl w:ilvl="4" w:tplc="8A58D1A8">
+      <w:numFmt w:val="decimal"/>
+      <w:lvlText w:val=""/>
+      <w:lvlJc w:val="left"/>
+    </w:lvl>
+    <w:lvl w:ilvl="5" w:tplc="B42695C8">
+      <w:numFmt w:val="decimal"/>
+      <w:lvlText w:val=""/>
+      <w:lvlJc w:val="left"/>
+    </w:lvl>
+    <w:lvl w:ilvl="6" w:tplc="A6BE54EA">
+      <w:numFmt w:val="decimal"/>
+      <w:lvlText w:val=""/>
+      <w:lvlJc w:val="left"/>
+    </w:lvl>
+    <w:lvl w:ilvl="7" w:tplc="F3D8702C">
+      <w:numFmt w:val="decimal"/>
+      <w:lvlText w:val=""/>
+      <w:lvlJc w:val="left"/>
+    </w:lvl>
+    <w:lvl w:ilvl="8" w:tplc="BBDEBB8E">
+      <w:numFmt w:val="decimal"/>
+      <w:lvlText w:val=""/>
+      <w:lvlJc w:val="left"/>
+    </w:lvl>
+  </w:abstractNum>
+  <w:num w:numId="1" w16cid:durableId="723413438">
+    <w:abstractNumId w:val="1"/>
+    <w:lvlOverride w:ilvl="0">
+      <w:startOverride w:val="1"/>
+    </w:lvlOverride>
+  </w:num>
+  <w:num w:numId="2" w16cid:durableId="302008898">
+    <w:abstractNumId w:val="0"/>
+    <w:lvlOverride w:ilvl="0">
+      <w:startOverride w:val="1"/>
+    </w:lvlOverride>
+  </w:num>
+  <w:num w:numId="3" w16cid:durableId="633562486">
+    <w:abstractNumId w:val="3"/>
+    <w:lvlOverride w:ilvl="0">
+      <w:startOverride w:val="1"/>
+    </w:lvlOverride>
+  </w:num>
+  <w:num w:numId="4" w16cid:durableId="1356955557">
     <w:abstractNumId w:val="4"/>
     <w:lvlOverride w:ilvl="0">
       <w:startOverride w:val="1"/>
     </w:lvlOverride>
   </w:num>
-  <w:num w:numId="2" w16cid:durableId="469830562">
-    <w:abstractNumId w:val="3"/>
-    <w:lvlOverride w:ilvl="0">
-      <w:startOverride w:val="1"/>
-    </w:lvlOverride>
-  </w:num>
-  <w:num w:numId="3" w16cid:durableId="1823541012">
-    <w:abstractNumId w:val="0"/>
-    <w:lvlOverride w:ilvl="0">
-      <w:startOverride w:val="1"/>
-    </w:lvlOverride>
-  </w:num>
-  <w:num w:numId="4" w16cid:durableId="928081450">
+  <w:num w:numId="5" w16cid:durableId="952788500">
     <w:abstractNumId w:val="2"/>
-    <w:lvlOverride w:ilvl="0">
-      <w:startOverride w:val="1"/>
-    </w:lvlOverride>
-  </w:num>
-  <w:num w:numId="5" w16cid:durableId="883296398">
-    <w:abstractNumId w:val="1"/>
     <w:lvlOverride w:ilvl="0">
       <w:startOverride w:val="1"/>
     </w:lvlOverride>
@@ -22186,7 +22218,7 @@
     <w:autoRedefine/>
     <w:uiPriority w:val="39"/>
     <w:unhideWhenUsed/>
-    <w:rsid w:val="003F12F3"/>
+    <w:rsid w:val="009C180A"/>
     <w:pPr>
       <w:spacing w:after="100"/>
     </w:pPr>
@@ -22198,7 +22230,7 @@
     <w:autoRedefine/>
     <w:uiPriority w:val="39"/>
     <w:unhideWhenUsed/>
-    <w:rsid w:val="003F12F3"/>
+    <w:rsid w:val="009C180A"/>
     <w:pPr>
       <w:spacing w:after="100"/>
       <w:ind w:left="210"/>

</xml_diff>